<commit_message>
working 4x4 button matrix and new cubeMX settings for potentiometer
</commit_message>
<xml_diff>
--- a/Verslag.docx
+++ b/Verslag.docx
@@ -9,7 +9,6 @@
           <w:bCs/>
           <w:sz w:val="36"/>
           <w:szCs w:val="36"/>
-          <w:lang w:val="en-US"/>
         </w:rPr>
       </w:pPr>
       <w:r>
@@ -18,12 +17,61 @@
           <w:bCs/>
           <w:sz w:val="36"/>
           <w:szCs w:val="36"/>
-          <w:lang w:val="en-US"/>
         </w:rPr>
         <w:t>Verslag Entertainment Tech 4x4 Matrix</w:t>
       </w:r>
     </w:p>
     <w:p>
+      <w:r>
+        <w:t>Dit verslag beschrijft de implementatie van een USB MIDI-keyboard met</w:t>
+      </w:r>
+      <w:r>
+        <w:t xml:space="preserve"> </w:t>
+      </w:r>
+      <w:r>
+        <w:t>een 4x4 knoppenmatrix aangestuurd via een MCP23S17 I/O expander. Het</w:t>
+      </w:r>
+      <w:r>
+        <w:t xml:space="preserve"> </w:t>
+      </w:r>
+      <w:r>
+        <w:t>project demonstreert:</w:t>
+      </w:r>
+    </w:p>
+    <w:p>
+      <w:r>
+        <w:t>- USB MIDI Device Class communicatie</w:t>
+      </w:r>
+    </w:p>
+    <w:p>
+      <w:r>
+        <w:t>- SPI-communicatie met een I/O expander</w:t>
+      </w:r>
+    </w:p>
+    <w:p>
+      <w:r>
+        <w:t>- Matrix scanning met debouncing</w:t>
+      </w:r>
+    </w:p>
+    <w:p>
+      <w:r>
+        <w:t>- Hardware abstractie op een STM32H5 microcontroller</w:t>
+      </w:r>
+    </w:p>
+    <w:p>
+      <w:pPr>
+        <w:rPr>
+          <w:lang w:val="en-US"/>
+        </w:rPr>
+      </w:pPr>
+      <w:r>
+        <w:rPr>
+          <w:lang w:val="en-US"/>
+        </w:rPr>
+        <w:t>- TinyUSB middleware integratie</w:t>
+      </w:r>
+    </w:p>
+    <w:p>
       <w:pPr>
         <w:rPr>
           <w:lang w:val="en-US"/>
@@ -44,15 +92,9 @@
       </w:r>
     </w:p>
     <w:p>
-      <w:pPr>
-        <w:rPr>
-          <w:lang w:val="en-US"/>
-        </w:rPr>
-      </w:pPr>
       <w:r>
         <w:rPr>
           <w:noProof/>
-          <w:lang w:val="en-US"/>
         </w:rPr>
         <w:drawing>
           <wp:inline distT="0" distB="0" distL="0" distR="0" wp14:anchorId="551FFD69" wp14:editId="628F4D48">
@@ -105,16 +147,11 @@
       </w:r>
     </w:p>
     <w:p>
-      <w:pPr>
-        <w:rPr>
-          <w:lang w:val="en-US"/>
-        </w:rPr>
-      </w:pPr>
       <w:r>
         <w:rPr>
           <w:noProof/>
-          <w:lang w:val="en-US"/>
-        </w:rPr>
+        </w:rPr>
+        <w:lastRenderedPageBreak/>
         <w:drawing>
           <wp:inline distT="0" distB="0" distL="0" distR="0" wp14:anchorId="0903D354" wp14:editId="72CF0478">
             <wp:extent cx="3360711" cy="3017782"/>
@@ -152,25 +189,16 @@
         </w:drawing>
       </w:r>
     </w:p>
-    <w:p>
-      <w:pPr>
-        <w:rPr>
-          <w:lang w:val="en-US"/>
-        </w:rPr>
-      </w:pPr>
-    </w:p>
-    <w:p>
-      <w:pPr>
-        <w:rPr>
-          <w:lang w:val="en-US"/>
-        </w:rPr>
-      </w:pPr>
-      <w:r>
-        <w:rPr>
-          <w:lang w:val="en-US"/>
-        </w:rPr>
-        <w:lastRenderedPageBreak/>
-        <w:t>SPI Wiring:</w:t>
+    <w:p/>
+    <w:p>
+      <w:r>
+        <w:t xml:space="preserve">SPI </w:t>
+      </w:r>
+      <w:r>
+        <w:t>Aansluiting</w:t>
+      </w:r>
+      <w:r>
+        <w:t>:</w:t>
       </w:r>
     </w:p>
     <w:tbl>
@@ -209,10 +237,7 @@
               <w:cnfStyle w:val="100000000000" w:firstRow="1" w:lastRow="0" w:firstColumn="0" w:lastColumn="0" w:oddVBand="0" w:evenVBand="0" w:oddHBand="0" w:evenHBand="0" w:firstRowFirstColumn="0" w:firstRowLastColumn="0" w:lastRowFirstColumn="0" w:lastRowLastColumn="0"/>
             </w:pPr>
             <w:r>
-              <w:t>STM32</w:t>
-            </w:r>
-            <w:r>
-              <w:t xml:space="preserve"> Pin</w:t>
+              <w:t>STM32 Pin</w:t>
             </w:r>
           </w:p>
         </w:tc>
@@ -245,7 +270,6 @@
               <w:rPr>
                 <w:b w:val="0"/>
                 <w:bCs w:val="0"/>
-                <w:lang w:val="en-US"/>
               </w:rPr>
             </w:pPr>
             <w:r>
@@ -264,9 +288,6 @@
           <w:p>
             <w:pPr>
               <w:cnfStyle w:val="000000100000" w:firstRow="0" w:lastRow="0" w:firstColumn="0" w:lastColumn="0" w:oddVBand="0" w:evenVBand="0" w:oddHBand="1" w:evenHBand="0" w:firstRowFirstColumn="0" w:firstRowLastColumn="0" w:lastRowFirstColumn="0" w:lastRowLastColumn="0"/>
-              <w:rPr>
-                <w:lang w:val="en-US"/>
-              </w:rPr>
             </w:pPr>
             <w:r>
               <w:t>PA5</w:t>
@@ -280,9 +301,6 @@
           <w:p>
             <w:pPr>
               <w:cnfStyle w:val="000000100000" w:firstRow="0" w:lastRow="0" w:firstColumn="0" w:lastColumn="0" w:oddVBand="0" w:evenVBand="0" w:oddHBand="1" w:evenHBand="0" w:firstRowFirstColumn="0" w:firstRowLastColumn="0" w:lastRowFirstColumn="0" w:lastRowLastColumn="0"/>
-              <w:rPr>
-                <w:lang w:val="en-US"/>
-              </w:rPr>
             </w:pPr>
             <w:r>
               <w:t>Chip Select, active low</w:t>
@@ -304,7 +322,6 @@
               <w:rPr>
                 <w:b w:val="0"/>
                 <w:bCs w:val="0"/>
-                <w:lang w:val="en-US"/>
               </w:rPr>
             </w:pPr>
             <w:r>
@@ -323,18 +340,9 @@
           <w:p>
             <w:pPr>
               <w:cnfStyle w:val="000000000000" w:firstRow="0" w:lastRow="0" w:firstColumn="0" w:lastColumn="0" w:oddVBand="0" w:evenVBand="0" w:oddHBand="0" w:evenHBand="0" w:firstRowFirstColumn="0" w:firstRowLastColumn="0" w:lastRowFirstColumn="0" w:lastRowLastColumn="0"/>
-              <w:rPr>
-                <w:lang w:val="en-US"/>
-              </w:rPr>
-            </w:pPr>
-            <w:r>
-              <w:t>(</w:t>
-            </w:r>
-            <w:r>
-              <w:t>PA12</w:t>
-            </w:r>
-            <w:r>
-              <w:t>) PB13</w:t>
+            </w:pPr>
+            <w:r>
+              <w:t>PB13</w:t>
             </w:r>
           </w:p>
         </w:tc>
@@ -345,9 +353,6 @@
           <w:p>
             <w:pPr>
               <w:cnfStyle w:val="000000000000" w:firstRow="0" w:lastRow="0" w:firstColumn="0" w:lastColumn="0" w:oddVBand="0" w:evenVBand="0" w:oddHBand="0" w:evenHBand="0" w:firstRowFirstColumn="0" w:firstRowLastColumn="0" w:lastRowFirstColumn="0" w:lastRowLastColumn="0"/>
-              <w:rPr>
-                <w:lang w:val="en-US"/>
-              </w:rPr>
             </w:pPr>
             <w:r>
               <w:t>SPI Clock</w:t>
@@ -370,7 +375,6 @@
               <w:rPr>
                 <w:b w:val="0"/>
                 <w:bCs w:val="0"/>
-                <w:lang w:val="en-US"/>
               </w:rPr>
             </w:pPr>
             <w:r>
@@ -389,18 +393,9 @@
           <w:p>
             <w:pPr>
               <w:cnfStyle w:val="000000100000" w:firstRow="0" w:lastRow="0" w:firstColumn="0" w:lastColumn="0" w:oddVBand="0" w:evenVBand="0" w:oddHBand="1" w:evenHBand="0" w:firstRowFirstColumn="0" w:firstRowLastColumn="0" w:lastRowFirstColumn="0" w:lastRowLastColumn="0"/>
-              <w:rPr>
-                <w:lang w:val="en-US"/>
-              </w:rPr>
-            </w:pPr>
-            <w:r>
-              <w:t>(</w:t>
-            </w:r>
-            <w:r>
-              <w:t>PA13</w:t>
-            </w:r>
-            <w:r>
-              <w:t>) PB15</w:t>
+            </w:pPr>
+            <w:r>
+              <w:t>PB15</w:t>
             </w:r>
           </w:p>
         </w:tc>
@@ -411,9 +406,6 @@
           <w:p>
             <w:pPr>
               <w:cnfStyle w:val="000000100000" w:firstRow="0" w:lastRow="0" w:firstColumn="0" w:lastColumn="0" w:oddVBand="0" w:evenVBand="0" w:oddHBand="1" w:evenHBand="0" w:firstRowFirstColumn="0" w:firstRowLastColumn="0" w:lastRowFirstColumn="0" w:lastRowLastColumn="0"/>
-              <w:rPr>
-                <w:lang w:val="en-US"/>
-              </w:rPr>
             </w:pPr>
             <w:r>
               <w:t>SPI Master Out</w:t>
@@ -435,7 +427,6 @@
               <w:rPr>
                 <w:b w:val="0"/>
                 <w:bCs w:val="0"/>
-                <w:lang w:val="en-US"/>
               </w:rPr>
             </w:pPr>
             <w:r>
@@ -454,18 +445,9 @@
           <w:p>
             <w:pPr>
               <w:cnfStyle w:val="000000000000" w:firstRow="0" w:lastRow="0" w:firstColumn="0" w:lastColumn="0" w:oddVBand="0" w:evenVBand="0" w:oddHBand="0" w:evenHBand="0" w:firstRowFirstColumn="0" w:firstRowLastColumn="0" w:lastRowFirstColumn="0" w:lastRowLastColumn="0"/>
-              <w:rPr>
-                <w:lang w:val="en-US"/>
-              </w:rPr>
-            </w:pPr>
-            <w:r>
-              <w:t>(</w:t>
-            </w:r>
-            <w:r>
-              <w:t>PA14</w:t>
-            </w:r>
-            <w:r>
-              <w:t>) PB14</w:t>
+            </w:pPr>
+            <w:r>
+              <w:t>PB14</w:t>
             </w:r>
           </w:p>
         </w:tc>
@@ -476,9 +458,6 @@
           <w:p>
             <w:pPr>
               <w:cnfStyle w:val="000000000000" w:firstRow="0" w:lastRow="0" w:firstColumn="0" w:lastColumn="0" w:oddVBand="0" w:evenVBand="0" w:oddHBand="0" w:evenHBand="0" w:firstRowFirstColumn="0" w:firstRowLastColumn="0" w:lastRowFirstColumn="0" w:lastRowLastColumn="0"/>
-              <w:rPr>
-                <w:lang w:val="en-US"/>
-              </w:rPr>
             </w:pPr>
             <w:r>
               <w:t>SPI Master In</w:t>
@@ -501,7 +480,6 @@
               <w:rPr>
                 <w:b w:val="0"/>
                 <w:bCs w:val="0"/>
-                <w:lang w:val="en-US"/>
               </w:rPr>
             </w:pPr>
             <w:r>
@@ -520,9 +498,6 @@
           <w:p>
             <w:pPr>
               <w:cnfStyle w:val="000000100000" w:firstRow="0" w:lastRow="0" w:firstColumn="0" w:lastColumn="0" w:oddVBand="0" w:evenVBand="0" w:oddHBand="1" w:evenHBand="0" w:firstRowFirstColumn="0" w:firstRowLastColumn="0" w:lastRowFirstColumn="0" w:lastRowLastColumn="0"/>
-              <w:rPr>
-                <w:lang w:val="en-US"/>
-              </w:rPr>
             </w:pPr>
             <w:r>
               <w:t>3V3 of MCU reset</w:t>
@@ -536,9 +511,6 @@
           <w:p>
             <w:pPr>
               <w:cnfStyle w:val="000000100000" w:firstRow="0" w:lastRow="0" w:firstColumn="0" w:lastColumn="0" w:oddVBand="0" w:evenVBand="0" w:oddHBand="1" w:evenHBand="0" w:firstRowFirstColumn="0" w:firstRowLastColumn="0" w:lastRowFirstColumn="0" w:lastRowLastColumn="0"/>
-              <w:rPr>
-                <w:lang w:val="nl-NL"/>
-              </w:rPr>
             </w:pPr>
             <w:r>
               <w:t>Kan op MCU-reset of losse reset</w:t>
@@ -560,7 +532,6 @@
               <w:rPr>
                 <w:b w:val="0"/>
                 <w:bCs w:val="0"/>
-                <w:lang w:val="en-US"/>
               </w:rPr>
             </w:pPr>
             <w:r>
@@ -579,9 +550,6 @@
           <w:p>
             <w:pPr>
               <w:cnfStyle w:val="000000000000" w:firstRow="0" w:lastRow="0" w:firstColumn="0" w:lastColumn="0" w:oddVBand="0" w:evenVBand="0" w:oddHBand="0" w:evenHBand="0" w:firstRowFirstColumn="0" w:firstRowLastColumn="0" w:lastRowFirstColumn="0" w:lastRowLastColumn="0"/>
-              <w:rPr>
-                <w:lang w:val="en-US"/>
-              </w:rPr>
             </w:pPr>
             <w:r>
               <w:t>3V3</w:t>
@@ -595,9 +563,6 @@
           <w:p>
             <w:pPr>
               <w:cnfStyle w:val="000000000000" w:firstRow="0" w:lastRow="0" w:firstColumn="0" w:lastColumn="0" w:oddVBand="0" w:evenVBand="0" w:oddHBand="0" w:evenHBand="0" w:firstRowFirstColumn="0" w:firstRowLastColumn="0" w:lastRowFirstColumn="0" w:lastRowLastColumn="0"/>
-              <w:rPr>
-                <w:lang w:val="en-US"/>
-              </w:rPr>
             </w:pPr>
             <w:r>
               <w:t>Voeding MCP23S17</w:t>
@@ -659,23 +624,9 @@
         </w:tc>
       </w:tr>
     </w:tbl>
-    <w:p>
-      <w:pPr>
-        <w:rPr>
-          <w:lang w:val="nl-NL"/>
-        </w:rPr>
-      </w:pPr>
-    </w:p>
-    <w:p>
-      <w:pPr>
-        <w:rPr>
-          <w:lang w:val="nl-NL"/>
-        </w:rPr>
-      </w:pPr>
-      <w:r>
-        <w:rPr>
-          <w:lang w:val="nl-NL"/>
-        </w:rPr>
+    <w:p/>
+    <w:p>
+      <w:r>
         <w:t>Knoppenmatrix aansluiting:</w:t>
       </w:r>
     </w:p>
@@ -754,7 +705,6 @@
               <w:rPr>
                 <w:b w:val="0"/>
                 <w:bCs w:val="0"/>
-                <w:lang w:val="en-US"/>
               </w:rPr>
             </w:pPr>
             <w:r>
@@ -769,9 +719,6 @@
           <w:p>
             <w:pPr>
               <w:cnfStyle w:val="000000100000" w:firstRow="0" w:lastRow="0" w:firstColumn="0" w:lastColumn="0" w:oddVBand="0" w:evenVBand="0" w:oddHBand="1" w:evenHBand="0" w:firstRowFirstColumn="0" w:firstRowLastColumn="0" w:lastRowFirstColumn="0" w:lastRowLastColumn="0"/>
-              <w:rPr>
-                <w:lang w:val="en-US"/>
-              </w:rPr>
             </w:pPr>
             <w:r>
               <w:t>GPA0</w:t>
@@ -785,9 +732,6 @@
           <w:p>
             <w:pPr>
               <w:cnfStyle w:val="000000100000" w:firstRow="0" w:lastRow="0" w:firstColumn="0" w:lastColumn="0" w:oddVBand="0" w:evenVBand="0" w:oddHBand="1" w:evenHBand="0" w:firstRowFirstColumn="0" w:firstRowLastColumn="0" w:lastRowFirstColumn="0" w:lastRowLastColumn="0"/>
-              <w:rPr>
-                <w:lang w:val="en-US"/>
-              </w:rPr>
             </w:pPr>
             <w:r>
               <w:t>Output</w:t>
@@ -809,7 +753,6 @@
               <w:rPr>
                 <w:b w:val="0"/>
                 <w:bCs w:val="0"/>
-                <w:lang w:val="en-US"/>
               </w:rPr>
             </w:pPr>
             <w:r>
@@ -824,9 +767,6 @@
           <w:p>
             <w:pPr>
               <w:cnfStyle w:val="000000000000" w:firstRow="0" w:lastRow="0" w:firstColumn="0" w:lastColumn="0" w:oddVBand="0" w:evenVBand="0" w:oddHBand="0" w:evenHBand="0" w:firstRowFirstColumn="0" w:firstRowLastColumn="0" w:lastRowFirstColumn="0" w:lastRowLastColumn="0"/>
-              <w:rPr>
-                <w:lang w:val="en-US"/>
-              </w:rPr>
             </w:pPr>
             <w:r>
               <w:t>GPA1</w:t>
@@ -840,9 +780,6 @@
           <w:p>
             <w:pPr>
               <w:cnfStyle w:val="000000000000" w:firstRow="0" w:lastRow="0" w:firstColumn="0" w:lastColumn="0" w:oddVBand="0" w:evenVBand="0" w:oddHBand="0" w:evenHBand="0" w:firstRowFirstColumn="0" w:firstRowLastColumn="0" w:lastRowFirstColumn="0" w:lastRowLastColumn="0"/>
-              <w:rPr>
-                <w:lang w:val="en-US"/>
-              </w:rPr>
             </w:pPr>
             <w:r>
               <w:t>Output</w:t>
@@ -865,7 +802,6 @@
               <w:rPr>
                 <w:b w:val="0"/>
                 <w:bCs w:val="0"/>
-                <w:lang w:val="en-US"/>
               </w:rPr>
             </w:pPr>
             <w:r>
@@ -880,9 +816,6 @@
           <w:p>
             <w:pPr>
               <w:cnfStyle w:val="000000100000" w:firstRow="0" w:lastRow="0" w:firstColumn="0" w:lastColumn="0" w:oddVBand="0" w:evenVBand="0" w:oddHBand="1" w:evenHBand="0" w:firstRowFirstColumn="0" w:firstRowLastColumn="0" w:lastRowFirstColumn="0" w:lastRowLastColumn="0"/>
-              <w:rPr>
-                <w:lang w:val="en-US"/>
-              </w:rPr>
             </w:pPr>
             <w:r>
               <w:t>GPA2</w:t>
@@ -896,9 +829,6 @@
           <w:p>
             <w:pPr>
               <w:cnfStyle w:val="000000100000" w:firstRow="0" w:lastRow="0" w:firstColumn="0" w:lastColumn="0" w:oddVBand="0" w:evenVBand="0" w:oddHBand="1" w:evenHBand="0" w:firstRowFirstColumn="0" w:firstRowLastColumn="0" w:lastRowFirstColumn="0" w:lastRowLastColumn="0"/>
-              <w:rPr>
-                <w:lang w:val="en-US"/>
-              </w:rPr>
             </w:pPr>
             <w:r>
               <w:t>Output</w:t>
@@ -920,7 +850,6 @@
               <w:rPr>
                 <w:b w:val="0"/>
                 <w:bCs w:val="0"/>
-                <w:lang w:val="en-US"/>
               </w:rPr>
             </w:pPr>
             <w:r>
@@ -935,9 +864,6 @@
           <w:p>
             <w:pPr>
               <w:cnfStyle w:val="000000000000" w:firstRow="0" w:lastRow="0" w:firstColumn="0" w:lastColumn="0" w:oddVBand="0" w:evenVBand="0" w:oddHBand="0" w:evenHBand="0" w:firstRowFirstColumn="0" w:firstRowLastColumn="0" w:lastRowFirstColumn="0" w:lastRowLastColumn="0"/>
-              <w:rPr>
-                <w:lang w:val="en-US"/>
-              </w:rPr>
             </w:pPr>
             <w:r>
               <w:t>GPA3</w:t>
@@ -951,9 +877,6 @@
           <w:p>
             <w:pPr>
               <w:cnfStyle w:val="000000000000" w:firstRow="0" w:lastRow="0" w:firstColumn="0" w:lastColumn="0" w:oddVBand="0" w:evenVBand="0" w:oddHBand="0" w:evenHBand="0" w:firstRowFirstColumn="0" w:firstRowLastColumn="0" w:lastRowFirstColumn="0" w:lastRowLastColumn="0"/>
-              <w:rPr>
-                <w:lang w:val="en-US"/>
-              </w:rPr>
             </w:pPr>
             <w:r>
               <w:t>Output</w:t>
@@ -976,7 +899,6 @@
               <w:rPr>
                 <w:b w:val="0"/>
                 <w:bCs w:val="0"/>
-                <w:lang w:val="en-US"/>
               </w:rPr>
             </w:pPr>
             <w:r>
@@ -991,9 +913,6 @@
           <w:p>
             <w:pPr>
               <w:cnfStyle w:val="000000100000" w:firstRow="0" w:lastRow="0" w:firstColumn="0" w:lastColumn="0" w:oddVBand="0" w:evenVBand="0" w:oddHBand="1" w:evenHBand="0" w:firstRowFirstColumn="0" w:firstRowLastColumn="0" w:lastRowFirstColumn="0" w:lastRowLastColumn="0"/>
-              <w:rPr>
-                <w:lang w:val="en-US"/>
-              </w:rPr>
             </w:pPr>
             <w:r>
               <w:t>GPB0</w:t>
@@ -1007,9 +926,6 @@
           <w:p>
             <w:pPr>
               <w:cnfStyle w:val="000000100000" w:firstRow="0" w:lastRow="0" w:firstColumn="0" w:lastColumn="0" w:oddVBand="0" w:evenVBand="0" w:oddHBand="1" w:evenHBand="0" w:firstRowFirstColumn="0" w:firstRowLastColumn="0" w:lastRowFirstColumn="0" w:lastRowLastColumn="0"/>
-              <w:rPr>
-                <w:lang w:val="nl-NL"/>
-              </w:rPr>
             </w:pPr>
             <w:r>
               <w:t>Input + Pull-up</w:t>
@@ -1031,7 +947,6 @@
               <w:rPr>
                 <w:b w:val="0"/>
                 <w:bCs w:val="0"/>
-                <w:lang w:val="en-US"/>
               </w:rPr>
             </w:pPr>
             <w:r>
@@ -1046,9 +961,6 @@
           <w:p>
             <w:pPr>
               <w:cnfStyle w:val="000000000000" w:firstRow="0" w:lastRow="0" w:firstColumn="0" w:lastColumn="0" w:oddVBand="0" w:evenVBand="0" w:oddHBand="0" w:evenHBand="0" w:firstRowFirstColumn="0" w:firstRowLastColumn="0" w:lastRowFirstColumn="0" w:lastRowLastColumn="0"/>
-              <w:rPr>
-                <w:lang w:val="en-US"/>
-              </w:rPr>
             </w:pPr>
             <w:r>
               <w:t>GPB1</w:t>
@@ -1062,9 +974,6 @@
           <w:p>
             <w:pPr>
               <w:cnfStyle w:val="000000000000" w:firstRow="0" w:lastRow="0" w:firstColumn="0" w:lastColumn="0" w:oddVBand="0" w:evenVBand="0" w:oddHBand="0" w:evenHBand="0" w:firstRowFirstColumn="0" w:firstRowLastColumn="0" w:lastRowFirstColumn="0" w:lastRowLastColumn="0"/>
-              <w:rPr>
-                <w:lang w:val="en-US"/>
-              </w:rPr>
             </w:pPr>
             <w:r>
               <w:t>Input + Pull-up</w:t>
@@ -1084,10 +993,7 @@
           </w:tcPr>
           <w:p>
             <w:r>
-              <w:t>R</w:t>
-            </w:r>
-            <w:r>
-              <w:t>3</w:t>
+              <w:t>R3</w:t>
             </w:r>
           </w:p>
         </w:tc>
@@ -1100,10 +1006,7 @@
               <w:cnfStyle w:val="000000100000" w:firstRow="0" w:lastRow="0" w:firstColumn="0" w:lastColumn="0" w:oddVBand="0" w:evenVBand="0" w:oddHBand="1" w:evenHBand="0" w:firstRowFirstColumn="0" w:firstRowLastColumn="0" w:lastRowFirstColumn="0" w:lastRowLastColumn="0"/>
             </w:pPr>
             <w:r>
-              <w:t>GPB</w:t>
-            </w:r>
-            <w:r>
-              <w:t>2</w:t>
+              <w:t>GPB2</w:t>
             </w:r>
           </w:p>
         </w:tc>
@@ -1132,10 +1035,7 @@
           </w:tcPr>
           <w:p>
             <w:r>
-              <w:t>R</w:t>
-            </w:r>
-            <w:r>
-              <w:t>4</w:t>
+              <w:t>R4</w:t>
             </w:r>
           </w:p>
         </w:tc>
@@ -1148,10 +1048,7 @@
               <w:cnfStyle w:val="000000000000" w:firstRow="0" w:lastRow="0" w:firstColumn="0" w:lastColumn="0" w:oddVBand="0" w:evenVBand="0" w:oddHBand="0" w:evenHBand="0" w:firstRowFirstColumn="0" w:firstRowLastColumn="0" w:lastRowFirstColumn="0" w:lastRowLastColumn="0"/>
             </w:pPr>
             <w:r>
-              <w:t>GPB</w:t>
-            </w:r>
-            <w:r>
-              <w:t>3</w:t>
+              <w:t>GPB3</w:t>
             </w:r>
           </w:p>
         </w:tc>
@@ -1170,23 +1067,9 @@
         </w:tc>
       </w:tr>
     </w:tbl>
-    <w:p>
-      <w:pPr>
-        <w:rPr>
-          <w:lang w:val="nl-NL"/>
-        </w:rPr>
-      </w:pPr>
-    </w:p>
-    <w:p>
-      <w:pPr>
-        <w:rPr>
-          <w:lang w:val="nl-NL"/>
-        </w:rPr>
-      </w:pPr>
-      <w:r>
-        <w:rPr>
-          <w:lang w:val="nl-NL"/>
-        </w:rPr>
+    <w:p/>
+    <w:p>
+      <w:r>
         <w:t>Andere:</w:t>
       </w:r>
     </w:p>
@@ -1213,6 +1096,7 @@
           </w:tcPr>
           <w:p>
             <w:r>
+              <w:lastRenderedPageBreak/>
               <w:t>Knopmatrix</w:t>
             </w:r>
           </w:p>
@@ -1259,7 +1143,6 @@
               <w:rPr>
                 <w:b w:val="0"/>
                 <w:bCs w:val="0"/>
-                <w:lang w:val="en-US"/>
               </w:rPr>
             </w:pPr>
             <w:r>
@@ -1274,14 +1157,8 @@
           <w:p>
             <w:pPr>
               <w:cnfStyle w:val="000000100000" w:firstRow="0" w:lastRow="0" w:firstColumn="0" w:lastColumn="0" w:oddVBand="0" w:evenVBand="0" w:oddHBand="1" w:evenHBand="0" w:firstRowFirstColumn="0" w:firstRowLastColumn="0" w:lastRowFirstColumn="0" w:lastRowLastColumn="0"/>
-              <w:rPr>
-                <w:lang w:val="en-US"/>
-              </w:rPr>
-            </w:pPr>
-            <w:r>
-              <w:rPr>
-                <w:lang w:val="en-US"/>
-              </w:rPr>
+            </w:pPr>
+            <w:r>
               <w:t>Voeding 3.3V</w:t>
             </w:r>
           </w:p>
@@ -1293,9 +1170,6 @@
           <w:p>
             <w:pPr>
               <w:cnfStyle w:val="000000100000" w:firstRow="0" w:lastRow="0" w:firstColumn="0" w:lastColumn="0" w:oddVBand="0" w:evenVBand="0" w:oddHBand="1" w:evenHBand="0" w:firstRowFirstColumn="0" w:firstRowLastColumn="0" w:lastRowFirstColumn="0" w:lastRowLastColumn="0"/>
-              <w:rPr>
-                <w:lang w:val="en-US"/>
-              </w:rPr>
             </w:pPr>
           </w:p>
         </w:tc>
@@ -1314,7 +1188,6 @@
               <w:rPr>
                 <w:b w:val="0"/>
                 <w:bCs w:val="0"/>
-                <w:lang w:val="en-US"/>
               </w:rPr>
             </w:pPr>
             <w:r>
@@ -1329,9 +1202,6 @@
           <w:p>
             <w:pPr>
               <w:cnfStyle w:val="000000000000" w:firstRow="0" w:lastRow="0" w:firstColumn="0" w:lastColumn="0" w:oddVBand="0" w:evenVBand="0" w:oddHBand="0" w:evenHBand="0" w:firstRowFirstColumn="0" w:firstRowLastColumn="0" w:lastRowFirstColumn="0" w:lastRowLastColumn="0"/>
-              <w:rPr>
-                <w:lang w:val="en-US"/>
-              </w:rPr>
             </w:pPr>
             <w:r>
               <w:t>GND</w:t>
@@ -1345,9 +1215,6 @@
           <w:p>
             <w:pPr>
               <w:cnfStyle w:val="000000000000" w:firstRow="0" w:lastRow="0" w:firstColumn="0" w:lastColumn="0" w:oddVBand="0" w:evenVBand="0" w:oddHBand="0" w:evenHBand="0" w:firstRowFirstColumn="0" w:firstRowLastColumn="0" w:lastRowFirstColumn="0" w:lastRowLastColumn="0"/>
-              <w:rPr>
-                <w:lang w:val="en-US"/>
-              </w:rPr>
             </w:pPr>
           </w:p>
         </w:tc>
@@ -1367,7 +1234,6 @@
               <w:rPr>
                 <w:b w:val="0"/>
                 <w:bCs w:val="0"/>
-                <w:lang w:val="en-US"/>
               </w:rPr>
             </w:pPr>
             <w:r>
@@ -1382,9 +1248,6 @@
           <w:p>
             <w:pPr>
               <w:cnfStyle w:val="000000100000" w:firstRow="0" w:lastRow="0" w:firstColumn="0" w:lastColumn="0" w:oddVBand="0" w:evenVBand="0" w:oddHBand="1" w:evenHBand="0" w:firstRowFirstColumn="0" w:firstRowLastColumn="0" w:lastRowFirstColumn="0" w:lastRowLastColumn="0"/>
-              <w:rPr>
-                <w:lang w:val="en-US"/>
-              </w:rPr>
             </w:pPr>
             <w:r>
               <w:t>GND</w:t>
@@ -1398,9 +1261,6 @@
           <w:p>
             <w:pPr>
               <w:cnfStyle w:val="000000100000" w:firstRow="0" w:lastRow="0" w:firstColumn="0" w:lastColumn="0" w:oddVBand="0" w:evenVBand="0" w:oddHBand="1" w:evenHBand="0" w:firstRowFirstColumn="0" w:firstRowLastColumn="0" w:lastRowFirstColumn="0" w:lastRowLastColumn="0"/>
-              <w:rPr>
-                <w:lang w:val="en-US"/>
-              </w:rPr>
             </w:pPr>
           </w:p>
         </w:tc>
@@ -1419,7 +1279,6 @@
               <w:rPr>
                 <w:b w:val="0"/>
                 <w:bCs w:val="0"/>
-                <w:lang w:val="en-US"/>
               </w:rPr>
             </w:pPr>
             <w:r>
@@ -1434,9 +1293,6 @@
           <w:p>
             <w:pPr>
               <w:cnfStyle w:val="000000000000" w:firstRow="0" w:lastRow="0" w:firstColumn="0" w:lastColumn="0" w:oddVBand="0" w:evenVBand="0" w:oddHBand="0" w:evenHBand="0" w:firstRowFirstColumn="0" w:firstRowLastColumn="0" w:lastRowFirstColumn="0" w:lastRowLastColumn="0"/>
-              <w:rPr>
-                <w:lang w:val="en-US"/>
-              </w:rPr>
             </w:pPr>
             <w:r>
               <w:t>GND</w:t>
@@ -1450,82 +1306,3450 @@
           <w:p>
             <w:pPr>
               <w:cnfStyle w:val="000000000000" w:firstRow="0" w:lastRow="0" w:firstColumn="0" w:lastColumn="0" w:oddVBand="0" w:evenVBand="0" w:oddHBand="0" w:evenHBand="0" w:firstRowFirstColumn="0" w:firstRowLastColumn="0" w:lastRowFirstColumn="0" w:lastRowLastColumn="0"/>
-              <w:rPr>
-                <w:lang w:val="en-US"/>
-              </w:rPr>
             </w:pPr>
           </w:p>
         </w:tc>
       </w:tr>
     </w:tbl>
-    <w:p>
-      <w:pPr>
-        <w:rPr>
-          <w:lang w:val="nl-NL"/>
-        </w:rPr>
-      </w:pPr>
-    </w:p>
-    <w:p>
-      <w:pPr>
-        <w:rPr>
-          <w:lang w:val="nl-NL"/>
-        </w:rPr>
-      </w:pPr>
-      <w:r>
-        <w:rPr>
-          <w:lang w:val="nl-NL"/>
-        </w:rPr>
-        <w:t>Opgelet, PA13 en PA14 mag je niet gebruiken, als je deze als GPIO insteld, kan je ze niet meer gebruiken voor de ST Link</w:t>
-      </w:r>
-      <w:r>
-        <w:rPr>
-          <w:lang w:val="nl-NL"/>
-        </w:rPr>
+    <w:p/>
+    <w:tbl>
+      <w:tblPr>
+        <w:tblStyle w:val="PlainTable1"/>
+        <w:tblW w:w="0" w:type="auto"/>
+        <w:tblLook w:val="04A0" w:firstRow="1" w:lastRow="0" w:firstColumn="1" w:lastColumn="0" w:noHBand="0" w:noVBand="1"/>
+      </w:tblPr>
+      <w:tblGrid>
+        <w:gridCol w:w="3005"/>
+        <w:gridCol w:w="3005"/>
+        <w:gridCol w:w="3006"/>
+      </w:tblGrid>
+      <w:tr>
+        <w:trPr>
+          <w:cnfStyle w:val="100000000000" w:firstRow="1" w:lastRow="0" w:firstColumn="0" w:lastColumn="0" w:oddVBand="0" w:evenVBand="0" w:oddHBand="0" w:evenHBand="0" w:firstRowFirstColumn="0" w:firstRowLastColumn="0" w:lastRowFirstColumn="0" w:lastRowLastColumn="0"/>
+          <w:trHeight w:val="340"/>
+        </w:trPr>
+        <w:tc>
+          <w:tcPr>
+            <w:cnfStyle w:val="001000000000" w:firstRow="0" w:lastRow="0" w:firstColumn="1" w:lastColumn="0" w:oddVBand="0" w:evenVBand="0" w:oddHBand="0" w:evenHBand="0" w:firstRowFirstColumn="0" w:firstRowLastColumn="0" w:lastRowFirstColumn="0" w:lastRowLastColumn="0"/>
+            <w:tcW w:w="3005" w:type="dxa"/>
+          </w:tcPr>
+          <w:p>
+            <w:r>
+              <w:t>Potentiometer</w:t>
+            </w:r>
+          </w:p>
+        </w:tc>
+        <w:tc>
+          <w:tcPr>
+            <w:tcW w:w="3005" w:type="dxa"/>
+          </w:tcPr>
+          <w:p>
+            <w:pPr>
+              <w:cnfStyle w:val="100000000000" w:firstRow="1" w:lastRow="0" w:firstColumn="0" w:lastColumn="0" w:oddVBand="0" w:evenVBand="0" w:oddHBand="0" w:evenHBand="0" w:firstRowFirstColumn="0" w:firstRowLastColumn="0" w:lastRowFirstColumn="0" w:lastRowLastColumn="0"/>
+            </w:pPr>
+            <w:r>
+              <w:t>Breadboard/STM32</w:t>
+            </w:r>
+          </w:p>
+        </w:tc>
+        <w:tc>
+          <w:tcPr>
+            <w:tcW w:w="3006" w:type="dxa"/>
+          </w:tcPr>
+          <w:p>
+            <w:pPr>
+              <w:cnfStyle w:val="100000000000" w:firstRow="1" w:lastRow="0" w:firstColumn="0" w:lastColumn="0" w:oddVBand="0" w:evenVBand="0" w:oddHBand="0" w:evenHBand="0" w:firstRowFirstColumn="0" w:firstRowLastColumn="0" w:lastRowFirstColumn="0" w:lastRowLastColumn="0"/>
+            </w:pPr>
+            <w:r>
+              <w:t>Type</w:t>
+            </w:r>
+          </w:p>
+        </w:tc>
+      </w:tr>
+      <w:tr>
+        <w:trPr>
+          <w:cnfStyle w:val="000000100000" w:firstRow="0" w:lastRow="0" w:firstColumn="0" w:lastColumn="0" w:oddVBand="0" w:evenVBand="0" w:oddHBand="1" w:evenHBand="0" w:firstRowFirstColumn="0" w:firstRowLastColumn="0" w:lastRowFirstColumn="0" w:lastRowLastColumn="0"/>
+          <w:trHeight w:val="340"/>
+        </w:trPr>
+        <w:tc>
+          <w:tcPr>
+            <w:cnfStyle w:val="001000000000" w:firstRow="0" w:lastRow="0" w:firstColumn="1" w:lastColumn="0" w:oddVBand="0" w:evenVBand="0" w:oddHBand="0" w:evenHBand="0" w:firstRowFirstColumn="0" w:firstRowLastColumn="0" w:lastRowFirstColumn="0" w:lastRowLastColumn="0"/>
+            <w:tcW w:w="3005" w:type="dxa"/>
+          </w:tcPr>
+          <w:p>
+            <w:pPr>
+              <w:rPr>
+                <w:b w:val="0"/>
+                <w:bCs w:val="0"/>
+              </w:rPr>
+            </w:pPr>
+            <w:r>
+              <w:t>Rechter pin</w:t>
+            </w:r>
+          </w:p>
+        </w:tc>
+        <w:tc>
+          <w:tcPr>
+            <w:tcW w:w="3005" w:type="dxa"/>
+          </w:tcPr>
+          <w:p>
+            <w:pPr>
+              <w:cnfStyle w:val="000000100000" w:firstRow="0" w:lastRow="0" w:firstColumn="0" w:lastColumn="0" w:oddVBand="0" w:evenVBand="0" w:oddHBand="1" w:evenHBand="0" w:firstRowFirstColumn="0" w:firstRowLastColumn="0" w:lastRowFirstColumn="0" w:lastRowLastColumn="0"/>
+            </w:pPr>
+            <w:r>
+              <w:t>Voeding 3.3V</w:t>
+            </w:r>
+          </w:p>
+        </w:tc>
+        <w:tc>
+          <w:tcPr>
+            <w:tcW w:w="3006" w:type="dxa"/>
+          </w:tcPr>
+          <w:p>
+            <w:pPr>
+              <w:cnfStyle w:val="000000100000" w:firstRow="0" w:lastRow="0" w:firstColumn="0" w:lastColumn="0" w:oddVBand="0" w:evenVBand="0" w:oddHBand="1" w:evenHBand="0" w:firstRowFirstColumn="0" w:firstRowLastColumn="0" w:lastRowFirstColumn="0" w:lastRowLastColumn="0"/>
+            </w:pPr>
+            <w:r>
+              <w:t>Voeding</w:t>
+            </w:r>
+          </w:p>
+        </w:tc>
+      </w:tr>
+      <w:tr>
+        <w:trPr>
+          <w:trHeight w:val="340"/>
+        </w:trPr>
+        <w:tc>
+          <w:tcPr>
+            <w:cnfStyle w:val="001000000000" w:firstRow="0" w:lastRow="0" w:firstColumn="1" w:lastColumn="0" w:oddVBand="0" w:evenVBand="0" w:oddHBand="0" w:evenHBand="0" w:firstRowFirstColumn="0" w:firstRowLastColumn="0" w:lastRowFirstColumn="0" w:lastRowLastColumn="0"/>
+            <w:tcW w:w="3005" w:type="dxa"/>
+          </w:tcPr>
+          <w:p>
+            <w:pPr>
+              <w:rPr>
+                <w:b w:val="0"/>
+                <w:bCs w:val="0"/>
+              </w:rPr>
+            </w:pPr>
+            <w:r>
+              <w:t>Linker pin</w:t>
+            </w:r>
+          </w:p>
+        </w:tc>
+        <w:tc>
+          <w:tcPr>
+            <w:tcW w:w="3005" w:type="dxa"/>
+          </w:tcPr>
+          <w:p>
+            <w:pPr>
+              <w:cnfStyle w:val="000000000000" w:firstRow="0" w:lastRow="0" w:firstColumn="0" w:lastColumn="0" w:oddVBand="0" w:evenVBand="0" w:oddHBand="0" w:evenHBand="0" w:firstRowFirstColumn="0" w:firstRowLastColumn="0" w:lastRowFirstColumn="0" w:lastRowLastColumn="0"/>
+            </w:pPr>
+            <w:r>
+              <w:t>GND</w:t>
+            </w:r>
+          </w:p>
+        </w:tc>
+        <w:tc>
+          <w:tcPr>
+            <w:tcW w:w="3006" w:type="dxa"/>
+          </w:tcPr>
+          <w:p>
+            <w:pPr>
+              <w:cnfStyle w:val="000000000000" w:firstRow="0" w:lastRow="0" w:firstColumn="0" w:lastColumn="0" w:oddVBand="0" w:evenVBand="0" w:oddHBand="0" w:evenHBand="0" w:firstRowFirstColumn="0" w:firstRowLastColumn="0" w:lastRowFirstColumn="0" w:lastRowLastColumn="0"/>
+            </w:pPr>
+            <w:r>
+              <w:t>GND</w:t>
+            </w:r>
+          </w:p>
+        </w:tc>
+      </w:tr>
+      <w:tr>
+        <w:trPr>
+          <w:cnfStyle w:val="000000100000" w:firstRow="0" w:lastRow="0" w:firstColumn="0" w:lastColumn="0" w:oddVBand="0" w:evenVBand="0" w:oddHBand="1" w:evenHBand="0" w:firstRowFirstColumn="0" w:firstRowLastColumn="0" w:lastRowFirstColumn="0" w:lastRowLastColumn="0"/>
+          <w:trHeight w:val="340"/>
+        </w:trPr>
+        <w:tc>
+          <w:tcPr>
+            <w:cnfStyle w:val="001000000000" w:firstRow="0" w:lastRow="0" w:firstColumn="1" w:lastColumn="0" w:oddVBand="0" w:evenVBand="0" w:oddHBand="0" w:evenHBand="0" w:firstRowFirstColumn="0" w:firstRowLastColumn="0" w:lastRowFirstColumn="0" w:lastRowLastColumn="0"/>
+            <w:tcW w:w="3005" w:type="dxa"/>
+          </w:tcPr>
+          <w:p>
+            <w:pPr>
+              <w:rPr>
+                <w:b w:val="0"/>
+                <w:bCs w:val="0"/>
+              </w:rPr>
+            </w:pPr>
+            <w:r>
+              <w:t>Middenste pin Potentio 1</w:t>
+            </w:r>
+          </w:p>
+        </w:tc>
+        <w:tc>
+          <w:tcPr>
+            <w:tcW w:w="3005" w:type="dxa"/>
+          </w:tcPr>
+          <w:p>
+            <w:pPr>
+              <w:cnfStyle w:val="000000100000" w:firstRow="0" w:lastRow="0" w:firstColumn="0" w:lastColumn="0" w:oddVBand="0" w:evenVBand="0" w:oddHBand="1" w:evenHBand="0" w:firstRowFirstColumn="0" w:firstRowLastColumn="0" w:lastRowFirstColumn="0" w:lastRowLastColumn="0"/>
+            </w:pPr>
+            <w:r>
+              <w:t>PA0</w:t>
+            </w:r>
+          </w:p>
+        </w:tc>
+        <w:tc>
+          <w:tcPr>
+            <w:tcW w:w="3006" w:type="dxa"/>
+          </w:tcPr>
+          <w:p>
+            <w:pPr>
+              <w:cnfStyle w:val="000000100000" w:firstRow="0" w:lastRow="0" w:firstColumn="0" w:lastColumn="0" w:oddVBand="0" w:evenVBand="0" w:oddHBand="1" w:evenHBand="0" w:firstRowFirstColumn="0" w:firstRowLastColumn="0" w:lastRowFirstColumn="0" w:lastRowLastColumn="0"/>
+            </w:pPr>
+            <w:r>
+              <w:t xml:space="preserve">Waarde </w:t>
+            </w:r>
+          </w:p>
+        </w:tc>
+      </w:tr>
+      <w:tr>
+        <w:trPr>
+          <w:trHeight w:val="340"/>
+        </w:trPr>
+        <w:tc>
+          <w:tcPr>
+            <w:cnfStyle w:val="001000000000" w:firstRow="0" w:lastRow="0" w:firstColumn="1" w:lastColumn="0" w:oddVBand="0" w:evenVBand="0" w:oddHBand="0" w:evenHBand="0" w:firstRowFirstColumn="0" w:firstRowLastColumn="0" w:lastRowFirstColumn="0" w:lastRowLastColumn="0"/>
+            <w:tcW w:w="3005" w:type="dxa"/>
+          </w:tcPr>
+          <w:p>
+            <w:pPr>
+              <w:rPr>
+                <w:b w:val="0"/>
+                <w:bCs w:val="0"/>
+              </w:rPr>
+            </w:pPr>
+            <w:r>
+              <w:t>Middenste pin Potentio</w:t>
+            </w:r>
+            <w:r>
+              <w:t xml:space="preserve"> 2</w:t>
+            </w:r>
+          </w:p>
+        </w:tc>
+        <w:tc>
+          <w:tcPr>
+            <w:tcW w:w="3005" w:type="dxa"/>
+          </w:tcPr>
+          <w:p>
+            <w:pPr>
+              <w:cnfStyle w:val="000000000000" w:firstRow="0" w:lastRow="0" w:firstColumn="0" w:lastColumn="0" w:oddVBand="0" w:evenVBand="0" w:oddHBand="0" w:evenHBand="0" w:firstRowFirstColumn="0" w:firstRowLastColumn="0" w:lastRowFirstColumn="0" w:lastRowLastColumn="0"/>
+            </w:pPr>
+            <w:r>
+              <w:t>PA</w:t>
+            </w:r>
+            <w:r>
+              <w:t>1</w:t>
+            </w:r>
+          </w:p>
+        </w:tc>
+        <w:tc>
+          <w:tcPr>
+            <w:tcW w:w="3006" w:type="dxa"/>
+          </w:tcPr>
+          <w:p>
+            <w:pPr>
+              <w:cnfStyle w:val="000000000000" w:firstRow="0" w:lastRow="0" w:firstColumn="0" w:lastColumn="0" w:oddVBand="0" w:evenVBand="0" w:oddHBand="0" w:evenHBand="0" w:firstRowFirstColumn="0" w:firstRowLastColumn="0" w:lastRowFirstColumn="0" w:lastRowLastColumn="0"/>
+            </w:pPr>
+            <w:r>
+              <w:t>Waarde</w:t>
+            </w:r>
+          </w:p>
+        </w:tc>
+      </w:tr>
+    </w:tbl>
+    <w:p/>
+    <w:p>
+      <w:r>
+        <w:rPr>
+          <w:b/>
+          <w:bCs/>
+          <w:sz w:val="32"/>
+          <w:szCs w:val="32"/>
+        </w:rPr>
+        <w:t>Systeemarchitectuur</w:t>
+      </w:r>
+    </w:p>
+    <w:p>
+      <w:r>
+        <w:t xml:space="preserve">   ┌─────────────────────┐</w:t>
+      </w:r>
+    </w:p>
+    <w:p>
+      <w:r>
+        <w:t xml:space="preserve">   │  4x4 Knoppenmatrix  │  16 mechanische toetsen</w:t>
+      </w:r>
+    </w:p>
+    <w:p>
+      <w:r>
+        <w:t xml:space="preserve">   │  (16 knoppen)       │  in rijen en kolommen</w:t>
+      </w:r>
+    </w:p>
+    <w:p>
+      <w:r>
+        <w:t xml:space="preserve">   └──────────</w:t>
+      </w:r>
+      <w:r>
+        <w:rPr>
+          <w:rFonts w:ascii="MS Gothic" w:eastAsia="MS Gothic" w:hAnsi="MS Gothic" w:cs="MS Gothic" w:hint="eastAsia"/>
+        </w:rPr>
+        <w:t>┬</w:t>
+      </w:r>
+      <w:r>
+        <w:rPr>
+          <w:rFonts w:ascii="Aptos" w:hAnsi="Aptos" w:cs="Aptos"/>
+        </w:rPr>
+        <w:t>──────────┘</w:t>
+      </w:r>
+    </w:p>
+    <w:p>
+      <w:r>
+        <w:t xml:space="preserve">              │ (rijen &amp; kolommen)</w:t>
+      </w:r>
+    </w:p>
+    <w:p>
+      <w:r>
+        <w:t xml:space="preserve">              │</w:t>
+      </w:r>
+    </w:p>
+    <w:p>
+      <w:r>
+        <w:t xml:space="preserve">         ┌────v────────────────┐</w:t>
+      </w:r>
+    </w:p>
+    <w:p>
+      <w:r>
+        <w:t xml:space="preserve">         │  MCP23S17           │  SPI I/O expander</w:t>
+      </w:r>
+    </w:p>
+    <w:p>
+      <w:pPr>
+        <w:rPr>
+          <w:lang w:val="en-US"/>
+        </w:rPr>
+      </w:pPr>
+      <w:r>
+        <w:rPr>
+          <w:lang w:val="en-US"/>
+        </w:rPr>
+        <w:t xml:space="preserve">         │  (I/O Expander)     │  • GPIOA: kolom-outputs</w:t>
+      </w:r>
+    </w:p>
+    <w:p>
+      <w:pPr>
+        <w:rPr>
+          <w:lang w:val="en-US"/>
+        </w:rPr>
+      </w:pPr>
+      <w:r>
+        <w:rPr>
+          <w:lang w:val="en-US"/>
+        </w:rPr>
+        <w:t xml:space="preserve">         │                     │  • GPIOB: rij-inputs</w:t>
+      </w:r>
+    </w:p>
+    <w:p>
+      <w:pPr>
+        <w:rPr>
+          <w:lang w:val="en-US"/>
+        </w:rPr>
+      </w:pPr>
+      <w:r>
+        <w:rPr>
+          <w:lang w:val="en-US"/>
+        </w:rPr>
+        <w:t xml:space="preserve">         └────────</w:t>
+      </w:r>
+      <w:r>
+        <w:rPr>
+          <w:rFonts w:ascii="MS Gothic" w:eastAsia="MS Gothic" w:hAnsi="MS Gothic" w:cs="MS Gothic" w:hint="eastAsia"/>
+          <w:lang w:val="en-US"/>
+        </w:rPr>
+        <w:t>┬</w:t>
+      </w:r>
+      <w:r>
+        <w:rPr>
+          <w:rFonts w:ascii="Aptos" w:hAnsi="Aptos" w:cs="Aptos"/>
+          <w:lang w:val="en-US"/>
+        </w:rPr>
+        <w:t>────────────┘</w:t>
+      </w:r>
+    </w:p>
+    <w:p>
+      <w:pPr>
+        <w:rPr>
+          <w:lang w:val="en-US"/>
+        </w:rPr>
+      </w:pPr>
+      <w:r>
+        <w:rPr>
+          <w:lang w:val="en-US"/>
+        </w:rPr>
+        <w:t xml:space="preserve">                  │ (SPI: SCK, MOSI, MISO, CS)</w:t>
+      </w:r>
+    </w:p>
+    <w:p>
+      <w:pPr>
+        <w:rPr>
+          <w:lang w:val="en-US"/>
+        </w:rPr>
+      </w:pPr>
+      <w:r>
+        <w:rPr>
+          <w:lang w:val="en-US"/>
+        </w:rPr>
+        <w:t xml:space="preserve">                  │</w:t>
+      </w:r>
+    </w:p>
+    <w:p>
+      <w:pPr>
+        <w:rPr>
+          <w:lang w:val="en-US"/>
+        </w:rPr>
+      </w:pPr>
+      <w:r>
+        <w:rPr>
+          <w:lang w:val="en-US"/>
+        </w:rPr>
+        <w:t xml:space="preserve">         ┌────────v──────────────────┐</w:t>
+      </w:r>
+    </w:p>
+    <w:p>
+      <w:pPr>
+        <w:rPr>
+          <w:lang w:val="en-US"/>
+        </w:rPr>
+      </w:pPr>
+      <w:r>
+        <w:rPr>
+          <w:lang w:val="en-US"/>
+        </w:rPr>
+        <w:t xml:space="preserve">         │   STM32H533 (Nucleo)      │  Microcontroller</w:t>
+      </w:r>
+    </w:p>
+    <w:p>
+      <w:pPr>
+        <w:rPr>
+          <w:lang w:val="en-US"/>
+        </w:rPr>
+      </w:pPr>
+      <w:r>
+        <w:rPr>
+          <w:lang w:val="en-US"/>
+        </w:rPr>
+        <w:t xml:space="preserve">         │   • SPI Master            │  • Matrix scanning</w:t>
+      </w:r>
+    </w:p>
+    <w:p>
+      <w:pPr>
+        <w:rPr>
+          <w:lang w:val="en-US"/>
+        </w:rPr>
+      </w:pPr>
+      <w:r>
+        <w:rPr>
+          <w:lang w:val="en-US"/>
+        </w:rPr>
+        <w:t xml:space="preserve">         │   • USB Device Mode       │  • Debouncing</w:t>
+      </w:r>
+    </w:p>
+    <w:p>
+      <w:pPr>
+        <w:rPr>
+          <w:lang w:val="en-US"/>
+        </w:rPr>
+      </w:pPr>
+      <w:r>
+        <w:rPr>
+          <w:lang w:val="en-US"/>
+        </w:rPr>
+        <w:t xml:space="preserve">         │   • TinyUSB Stack         │  • MIDI generatie</w:t>
+      </w:r>
+    </w:p>
+    <w:p>
+      <w:pPr>
+        <w:rPr>
+          <w:lang w:val="en-US"/>
+        </w:rPr>
+      </w:pPr>
+      <w:r>
+        <w:rPr>
+          <w:lang w:val="en-US"/>
+        </w:rPr>
+        <w:t xml:space="preserve">         └────────</w:t>
+      </w:r>
+      <w:r>
+        <w:rPr>
+          <w:rFonts w:ascii="MS Gothic" w:eastAsia="MS Gothic" w:hAnsi="MS Gothic" w:cs="MS Gothic" w:hint="eastAsia"/>
+          <w:lang w:val="en-US"/>
+        </w:rPr>
+        <w:t>┬</w:t>
+      </w:r>
+      <w:r>
+        <w:rPr>
+          <w:rFonts w:ascii="Aptos" w:hAnsi="Aptos" w:cs="Aptos"/>
+          <w:lang w:val="en-US"/>
+        </w:rPr>
+        <w:t>──────────────────┘</w:t>
+      </w:r>
+    </w:p>
+    <w:p>
+      <w:pPr>
+        <w:rPr>
+          <w:lang w:val="en-US"/>
+        </w:rPr>
+      </w:pPr>
+      <w:r>
+        <w:rPr>
+          <w:lang w:val="en-US"/>
+        </w:rPr>
+        <w:t xml:space="preserve">                  │ (USB)</w:t>
+      </w:r>
+    </w:p>
+    <w:p>
+      <w:pPr>
+        <w:rPr>
+          <w:lang w:val="en-US"/>
+        </w:rPr>
+      </w:pPr>
+      <w:r>
+        <w:rPr>
+          <w:lang w:val="en-US"/>
+        </w:rPr>
+        <w:lastRenderedPageBreak/>
+        <w:t xml:space="preserve">                  │</w:t>
+      </w:r>
+    </w:p>
+    <w:p>
+      <w:pPr>
+        <w:rPr>
+          <w:lang w:val="en-US"/>
+        </w:rPr>
+      </w:pPr>
+      <w:r>
+        <w:rPr>
+          <w:lang w:val="en-US"/>
+        </w:rPr>
+        <w:t xml:space="preserve">         ┌────────v──────────────┐</w:t>
+      </w:r>
+    </w:p>
+    <w:p>
+      <w:pPr>
+        <w:rPr>
+          <w:lang w:val="en-US"/>
+        </w:rPr>
+      </w:pPr>
+      <w:r>
+        <w:rPr>
+          <w:lang w:val="en-US"/>
+        </w:rPr>
+        <w:t xml:space="preserve">         │  Computer/DAW         │  MIDI ontvanger</w:t>
+      </w:r>
+    </w:p>
+    <w:p>
+      <w:pPr>
+        <w:rPr>
+          <w:lang w:val="en-US"/>
+        </w:rPr>
+      </w:pPr>
+      <w:r>
+        <w:rPr>
+          <w:lang w:val="en-US"/>
+        </w:rPr>
+        <w:t xml:space="preserve">         │  (MIDI Synthesizer)   │</w:t>
+      </w:r>
+    </w:p>
+    <w:p>
+      <w:pPr>
+        <w:rPr>
+          <w:lang w:val="en-US"/>
+        </w:rPr>
+      </w:pPr>
+      <w:r>
+        <w:rPr>
+          <w:lang w:val="en-US"/>
+        </w:rPr>
+        <w:t xml:space="preserve">         └───────────────────────┘</w:t>
+      </w:r>
+    </w:p>
+    <w:p>
+      <w:pPr>
+        <w:rPr>
+          <w:b/>
+          <w:bCs/>
+          <w:sz w:val="36"/>
+          <w:szCs w:val="36"/>
+          <w:lang w:val="en-US"/>
+        </w:rPr>
+      </w:pPr>
+      <w:r>
+        <w:rPr>
+          <w:b/>
+          <w:bCs/>
+          <w:sz w:val="36"/>
+          <w:szCs w:val="36"/>
+          <w:lang w:val="en-US"/>
+        </w:rPr>
+        <w:t>Pinout en outputs</w:t>
+      </w:r>
+    </w:p>
+    <w:p>
+      <w:pPr>
+        <w:rPr>
+          <w:b/>
+          <w:bCs/>
+          <w:lang w:val="en-US"/>
+        </w:rPr>
+      </w:pPr>
+      <w:r>
+        <w:rPr>
+          <w:b/>
+          <w:bCs/>
+          <w:lang w:val="en-US"/>
+        </w:rPr>
+        <w:t>GPIOA (Kolommen - Outputs)</w:t>
+      </w:r>
+    </w:p>
+    <w:p>
+      <w:r>
+        <w:rPr>
+          <w:lang w:val="en-US"/>
+        </w:rPr>
+        <w:t xml:space="preserve">   </w:t>
+      </w:r>
+      <w:r>
+        <w:t>GPA0 = Kolom 0 (laag = geselecteerd)</w:t>
+      </w:r>
+    </w:p>
+    <w:p>
+      <w:r>
+        <w:t xml:space="preserve">   GPA1 = Kolom 1</w:t>
+      </w:r>
+    </w:p>
+    <w:p>
+      <w:r>
+        <w:t xml:space="preserve">   GPA2 = Kolom 2</w:t>
+      </w:r>
+    </w:p>
+    <w:p>
+      <w:r>
+        <w:t xml:space="preserve">   GPA3 = Kolom 3</w:t>
+      </w:r>
+    </w:p>
+    <w:p>
+      <w:pPr>
+        <w:rPr>
+          <w:b/>
+          <w:bCs/>
+        </w:rPr>
+      </w:pPr>
+      <w:r>
+        <w:rPr>
+          <w:b/>
+          <w:bCs/>
+        </w:rPr>
+        <w:t>GPIOB (Rijen - Inputs met Pull-ups)</w:t>
+      </w:r>
+    </w:p>
+    <w:p>
+      <w:r>
+        <w:t xml:space="preserve">   GPB0 = Rij 0 (laag = knop ingedrukt)</w:t>
+      </w:r>
+    </w:p>
+    <w:p>
+      <w:r>
+        <w:t xml:space="preserve">   GPB1 = Rij 1</w:t>
+      </w:r>
+    </w:p>
+    <w:p>
+      <w:r>
+        <w:t xml:space="preserve">   GPB2 = Rij 2</w:t>
+      </w:r>
+    </w:p>
+    <w:p>
+      <w:r>
+        <w:t xml:space="preserve">   GPB3 = Rij 3</w:t>
+      </w:r>
+    </w:p>
+    <w:p/>
+    <w:p>
+      <w:pPr>
+        <w:rPr>
+          <w:b/>
+          <w:bCs/>
+          <w:sz w:val="32"/>
+          <w:szCs w:val="32"/>
+        </w:rPr>
+      </w:pPr>
+      <w:r>
+        <w:rPr>
+          <w:b/>
+          <w:bCs/>
+          <w:sz w:val="32"/>
+          <w:szCs w:val="32"/>
+        </w:rPr>
+        <w:t>USB-voeding Jumper-instellingen</w:t>
+      </w:r>
+    </w:p>
+    <w:p>
+      <w:r>
+        <w:t>De Nucleo-H533RE</w:t>
+      </w:r>
+      <w:r>
+        <w:t xml:space="preserve"> </w:t>
+      </w:r>
+      <w:r>
+        <w:t>heeft jumpers voor USB-voeding configuratie:</w:t>
+      </w:r>
+    </w:p>
+    <w:p>
+      <w:r>
+        <w:t>P1</w:t>
+      </w:r>
+      <w:r>
+        <w:t xml:space="preserve"> </w:t>
+      </w:r>
+      <w:r>
+        <w:t>Via USB</w:t>
+      </w:r>
+      <w:r>
+        <w:t>:</w:t>
+      </w:r>
+      <w:r>
+        <w:t xml:space="preserve">  USB levert voeding (normaal geval)</w:t>
+      </w:r>
+    </w:p>
+    <w:p>
+      <w:r>
+        <w:t xml:space="preserve">P2: </w:t>
+      </w:r>
+      <w:r>
+        <w:t>Externe voeding</w:t>
+      </w:r>
+      <w:r>
+        <w:t>:</w:t>
+      </w:r>
+      <w:r>
+        <w:t xml:space="preserve"> 5V externe bron (optioneel)</w:t>
+      </w:r>
+    </w:p>
+    <w:p/>
+    <w:p>
+      <w:pPr>
+        <w:rPr>
+          <w:b/>
+          <w:bCs/>
+          <w:sz w:val="32"/>
+          <w:szCs w:val="32"/>
+          <w:lang w:val="en-US"/>
+        </w:rPr>
+      </w:pPr>
+      <w:r>
+        <w:rPr>
+          <w:b/>
+          <w:bCs/>
+          <w:sz w:val="32"/>
+          <w:szCs w:val="32"/>
+          <w:lang w:val="en-US"/>
+        </w:rPr>
+        <w:t>Wat is USB MIDI Device Class?</w:t>
+      </w:r>
+    </w:p>
+    <w:p>
+      <w:r>
+        <w:t>USB MIDI Class is een USB-standaard die muziekinstrumenten toestaat</w:t>
+      </w:r>
+    </w:p>
+    <w:p>
+      <w:r>
+        <w:t>communication via USB zonder custom drivers:</w:t>
+      </w:r>
+    </w:p>
+    <w:p>
+      <w:r>
+        <w:t>- Eenvoudige plug-and-play op Windows, macOS, Linux</w:t>
+      </w:r>
+    </w:p>
+    <w:p>
+      <w:r>
+        <w:t>- MIDI-berichten over USB-bulktransfer</w:t>
+      </w:r>
+    </w:p>
+    <w:p>
+      <w:r>
+        <w:t>- 16 MIDI-kanalen mogelijk per USB-aansluiting</w:t>
+      </w:r>
+    </w:p>
+    <w:p>
+      <w:pPr>
+        <w:rPr>
+          <w:lang w:val="it-IT"/>
+        </w:rPr>
+      </w:pPr>
+      <w:r>
+        <w:rPr>
+          <w:lang w:val="it-IT"/>
+        </w:rPr>
+        <w:t>- Compatibel met alle DAW-software (FL Studio, Ableton, Logic, etc.)</w:t>
+      </w:r>
+    </w:p>
+    <w:p>
+      <w:pPr>
+        <w:rPr>
+          <w:lang w:val="it-IT"/>
+        </w:rPr>
+      </w:pPr>
+    </w:p>
+    <w:p>
+      <w:pPr>
+        <w:rPr>
+          <w:b/>
+          <w:bCs/>
+          <w:sz w:val="32"/>
+          <w:szCs w:val="32"/>
+        </w:rPr>
+      </w:pPr>
+      <w:r>
+        <w:rPr>
+          <w:b/>
+          <w:bCs/>
+          <w:sz w:val="32"/>
+          <w:szCs w:val="32"/>
+        </w:rPr>
+        <w:lastRenderedPageBreak/>
+        <w:t>USB Descriptor</w:t>
+      </w:r>
+    </w:p>
+    <w:p>
+      <w:r>
+        <w:t>Een USB descriptor definieert wat het apparaat is voor het host-systeem.</w:t>
+      </w:r>
+    </w:p>
+    <w:p>
+      <w:pPr>
+        <w:rPr>
+          <w:b/>
+          <w:bCs/>
+        </w:rPr>
+      </w:pPr>
+      <w:r>
+        <w:rPr>
+          <w:b/>
+          <w:bCs/>
+        </w:rPr>
+        <w:t>Minimale MIDI USB Descriptor structuur:</w:t>
+      </w:r>
+    </w:p>
+    <w:p/>
+    <w:p>
+      <w:r>
+        <w:t>::</w:t>
+      </w:r>
+    </w:p>
+    <w:p/>
+    <w:p>
+      <w:r>
+        <w:t xml:space="preserve">   Device Descriptor</w:t>
+      </w:r>
+    </w:p>
+    <w:p>
+      <w:r>
+        <w:t xml:space="preserve">   </w:t>
+      </w:r>
+      <w:r>
+        <w:rPr>
+          <w:rFonts w:ascii="MS Gothic" w:eastAsia="MS Gothic" w:hAnsi="MS Gothic" w:cs="MS Gothic" w:hint="eastAsia"/>
+        </w:rPr>
+        <w:t>├</w:t>
+      </w:r>
+      <w:r>
+        <w:rPr>
+          <w:rFonts w:ascii="Aptos" w:hAnsi="Aptos" w:cs="Aptos"/>
+        </w:rPr>
+        <w:t>─</w:t>
+      </w:r>
+      <w:r>
+        <w:t xml:space="preserve"> idVendor: 0x2E8A (TinyUSB)</w:t>
+      </w:r>
+    </w:p>
+    <w:p>
+      <w:r>
+        <w:t xml:space="preserve">   </w:t>
+      </w:r>
+      <w:r>
+        <w:rPr>
+          <w:rFonts w:ascii="MS Gothic" w:eastAsia="MS Gothic" w:hAnsi="MS Gothic" w:cs="MS Gothic" w:hint="eastAsia"/>
+        </w:rPr>
+        <w:t>├</w:t>
+      </w:r>
+      <w:r>
+        <w:rPr>
+          <w:rFonts w:ascii="Aptos" w:hAnsi="Aptos" w:cs="Aptos"/>
+        </w:rPr>
+        <w:t>─</w:t>
+      </w:r>
+      <w:r>
+        <w:t xml:space="preserve"> idProduct: 0x000B (MIDI device)</w:t>
+      </w:r>
+    </w:p>
+    <w:p>
+      <w:r>
+        <w:t xml:space="preserve">   </w:t>
+      </w:r>
+      <w:r>
+        <w:rPr>
+          <w:rFonts w:ascii="MS Gothic" w:eastAsia="MS Gothic" w:hAnsi="MS Gothic" w:cs="MS Gothic" w:hint="eastAsia"/>
+        </w:rPr>
+        <w:t>├</w:t>
+      </w:r>
+      <w:r>
+        <w:rPr>
+          <w:rFonts w:ascii="Aptos" w:hAnsi="Aptos" w:cs="Aptos"/>
+        </w:rPr>
+        <w:t>─</w:t>
+      </w:r>
+      <w:r>
+        <w:t xml:space="preserve"> bDeviceClass: 0x00 (Defined at interface level)</w:t>
+      </w:r>
+    </w:p>
+    <w:p>
+      <w:r>
+        <w:t xml:space="preserve">   └─ bConfigurationValue: 1</w:t>
+      </w:r>
+    </w:p>
+    <w:p/>
+    <w:p>
+      <w:r>
+        <w:t xml:space="preserve">   Configuration Descriptor</w:t>
+      </w:r>
+    </w:p>
+    <w:p>
+      <w:r>
+        <w:t xml:space="preserve">   └─ Interface Descriptor</w:t>
+      </w:r>
+    </w:p>
+    <w:p>
+      <w:r>
+        <w:t xml:space="preserve">      </w:t>
+      </w:r>
+      <w:r>
+        <w:rPr>
+          <w:rFonts w:ascii="MS Gothic" w:eastAsia="MS Gothic" w:hAnsi="MS Gothic" w:cs="MS Gothic" w:hint="eastAsia"/>
+        </w:rPr>
+        <w:t>├</w:t>
+      </w:r>
+      <w:r>
+        <w:rPr>
+          <w:rFonts w:ascii="Aptos" w:hAnsi="Aptos" w:cs="Aptos"/>
+        </w:rPr>
+        <w:t>─</w:t>
+      </w:r>
+      <w:r>
+        <w:t xml:space="preserve"> bInterfaceClass: 0x01 (Audio)</w:t>
+      </w:r>
+    </w:p>
+    <w:p>
+      <w:r>
+        <w:t xml:space="preserve">      </w:t>
+      </w:r>
+      <w:r>
+        <w:rPr>
+          <w:rFonts w:ascii="MS Gothic" w:eastAsia="MS Gothic" w:hAnsi="MS Gothic" w:cs="MS Gothic" w:hint="eastAsia"/>
+        </w:rPr>
+        <w:t>├</w:t>
+      </w:r>
+      <w:r>
+        <w:rPr>
+          <w:rFonts w:ascii="Aptos" w:hAnsi="Aptos" w:cs="Aptos"/>
+        </w:rPr>
+        <w:t>─</w:t>
+      </w:r>
+      <w:r>
+        <w:t xml:space="preserve"> bInterfaceSubClass: 0x03 (MIDI Streaming)</w:t>
+      </w:r>
+    </w:p>
+    <w:p>
+      <w:pPr>
+        <w:rPr>
+          <w:lang w:val="en-US"/>
+        </w:rPr>
+      </w:pPr>
+      <w:r>
+        <w:t xml:space="preserve">      </w:t>
+      </w:r>
+      <w:r>
+        <w:rPr>
+          <w:lang w:val="en-US"/>
+        </w:rPr>
+        <w:t>└─ Endpoints:</w:t>
+      </w:r>
+    </w:p>
+    <w:p>
+      <w:pPr>
+        <w:rPr>
+          <w:lang w:val="en-US"/>
+        </w:rPr>
+      </w:pPr>
+      <w:r>
+        <w:rPr>
+          <w:lang w:val="en-US"/>
+        </w:rPr>
+        <w:t xml:space="preserve">         </w:t>
+      </w:r>
+      <w:r>
+        <w:rPr>
+          <w:rFonts w:ascii="MS Gothic" w:eastAsia="MS Gothic" w:hAnsi="MS Gothic" w:cs="MS Gothic" w:hint="eastAsia"/>
+          <w:lang w:val="en-US"/>
+        </w:rPr>
+        <w:t>├</w:t>
+      </w:r>
+      <w:r>
+        <w:rPr>
+          <w:rFonts w:ascii="Aptos" w:hAnsi="Aptos" w:cs="Aptos"/>
+          <w:lang w:val="en-US"/>
+        </w:rPr>
+        <w:t>─</w:t>
+      </w:r>
+      <w:r>
+        <w:rPr>
+          <w:lang w:val="en-US"/>
+        </w:rPr>
+        <w:t xml:space="preserve"> EP OUT (Host </w:t>
+      </w:r>
+      <w:r>
+        <w:rPr>
+          <w:rFonts w:ascii="Aptos" w:hAnsi="Aptos" w:cs="Aptos"/>
+          <w:lang w:val="en-US"/>
+        </w:rPr>
+        <w:t>→</w:t>
+      </w:r>
+      <w:r>
+        <w:rPr>
+          <w:lang w:val="en-US"/>
+        </w:rPr>
+        <w:t xml:space="preserve"> Device): MIDI In</w:t>
+      </w:r>
+    </w:p>
+    <w:p>
+      <w:pPr>
+        <w:rPr>
+          <w:lang w:val="en-US"/>
+        </w:rPr>
+      </w:pPr>
+      <w:r>
+        <w:rPr>
+          <w:lang w:val="en-US"/>
+        </w:rPr>
+        <w:t xml:space="preserve">         </w:t>
+      </w:r>
+      <w:r>
+        <w:rPr>
+          <w:rFonts w:ascii="MS Gothic" w:eastAsia="MS Gothic" w:hAnsi="MS Gothic" w:cs="MS Gothic" w:hint="eastAsia"/>
+          <w:lang w:val="en-US"/>
+        </w:rPr>
+        <w:t>├</w:t>
+      </w:r>
+      <w:r>
+        <w:rPr>
+          <w:rFonts w:ascii="Aptos" w:hAnsi="Aptos" w:cs="Aptos"/>
+          <w:lang w:val="en-US"/>
+        </w:rPr>
+        <w:t>─</w:t>
+      </w:r>
+      <w:r>
+        <w:rPr>
+          <w:lang w:val="en-US"/>
+        </w:rPr>
+        <w:t xml:space="preserve"> EP IN (Device </w:t>
+      </w:r>
+      <w:r>
+        <w:rPr>
+          <w:rFonts w:ascii="Aptos" w:hAnsi="Aptos" w:cs="Aptos"/>
+          <w:lang w:val="en-US"/>
+        </w:rPr>
+        <w:t>→</w:t>
+      </w:r>
+      <w:r>
+        <w:rPr>
+          <w:lang w:val="en-US"/>
+        </w:rPr>
+        <w:t xml:space="preserve"> Host): MIDI Out</w:t>
+      </w:r>
+    </w:p>
+    <w:p>
+      <w:pPr>
+        <w:rPr>
+          <w:lang w:val="en-US"/>
+        </w:rPr>
+      </w:pPr>
+    </w:p>
+    <w:p>
+      <w:r>
+        <w:rPr>
+          <w:b/>
+          <w:bCs/>
+        </w:rPr>
+        <w:t>Praktische betekenis:</w:t>
+      </w:r>
+      <w:r>
+        <w:t xml:space="preserve"> </w:t>
+      </w:r>
+      <w:r>
+        <w:t>Windows/macOS herkent dit apparaat</w:t>
+      </w:r>
+    </w:p>
+    <w:p>
+      <w:r>
+        <w:t>automatisch als “USB MIDI Device” - Geen driverinstallatie nodig -</w:t>
+      </w:r>
+    </w:p>
+    <w:p>
+      <w:r>
+        <w:t>Apparaat verschijnt in alle DAW’s onder “MIDI In/Out”</w:t>
+      </w:r>
+    </w:p>
+    <w:p/>
+    <w:p>
+      <w:pPr>
+        <w:rPr>
+          <w:b/>
+          <w:bCs/>
+          <w:sz w:val="32"/>
+          <w:szCs w:val="32"/>
+        </w:rPr>
+      </w:pPr>
+      <w:r>
+        <w:rPr>
+          <w:b/>
+          <w:bCs/>
+          <w:sz w:val="32"/>
+          <w:szCs w:val="32"/>
+        </w:rPr>
+        <w:t>Configuratie in het Project</w:t>
+      </w:r>
+    </w:p>
+    <w:p>
+      <w:r>
+        <w:t>In ``tusb_config.h``:</w:t>
+      </w:r>
+    </w:p>
+    <w:p/>
+    <w:p>
+      <w:r>
+        <w:t xml:space="preserve">   #define CFG_TUSB_MCU           OPT_MCU_STM32H5</w:t>
+      </w:r>
+    </w:p>
+    <w:p>
+      <w:r>
+        <w:t xml:space="preserve">   #define CFG_TUSB_OS            OPT_OS_NONE</w:t>
+      </w:r>
+    </w:p>
+    <w:p>
+      <w:r>
+        <w:t xml:space="preserve">   #define CFG_TUSB_RHPORT0_MODE  OPT_MODE_DEVICE</w:t>
+      </w:r>
+    </w:p>
+    <w:p>
+      <w:r>
+        <w:lastRenderedPageBreak/>
+        <w:t xml:space="preserve">   #define CFG_TUD_MIDI           1</w:t>
+      </w:r>
+    </w:p>
+    <w:p/>
+    <w:p>
+      <w:r>
+        <w:t>Dit vertelt TinyUSB: “Configureer dit board als MIDI USB device”</w:t>
+      </w:r>
+    </w:p>
+    <w:p/>
+    <w:p>
+      <w:pPr>
+        <w:rPr>
+          <w:b/>
+          <w:bCs/>
+        </w:rPr>
+      </w:pPr>
+      <w:r>
+        <w:rPr>
+          <w:b/>
+          <w:bCs/>
+        </w:rPr>
+        <w:t>Wat is TinyUSB?</w:t>
+      </w:r>
+    </w:p>
+    <w:p>
+      <w:r>
+        <w:t>TinyUSB is een opensource USB stack speciaal voor embedded systems:</w:t>
+      </w:r>
+    </w:p>
+    <w:p/>
+    <w:p>
+      <w:r>
+        <w:t>- Lichtgewicht (klein RAM/Flash footprint)</w:t>
+      </w:r>
+    </w:p>
+    <w:p>
+      <w:r>
+        <w:t>- Meerdere USB device classes (MIDI, HID, CDC, etc.)</w:t>
+      </w:r>
+    </w:p>
+    <w:p>
+      <w:pPr>
+        <w:rPr>
+          <w:lang w:val="en-US"/>
+        </w:rPr>
+      </w:pPr>
+      <w:r>
+        <w:rPr>
+          <w:lang w:val="en-US"/>
+        </w:rPr>
+        <w:t>- Cross-platform (STM32, nRF52, RP2040, etc.)</w:t>
+      </w:r>
+    </w:p>
+    <w:p>
+      <w:r>
+        <w:t>- Gratis and open-source (MIT licentie)</w:t>
+      </w:r>
+    </w:p>
+    <w:p/>
+    <w:p>
+      <w:pPr>
+        <w:rPr>
+          <w:b/>
+          <w:bCs/>
+          <w:sz w:val="24"/>
+          <w:szCs w:val="24"/>
+        </w:rPr>
+      </w:pPr>
+      <w:r>
+        <w:rPr>
+          <w:b/>
+          <w:bCs/>
+          <w:sz w:val="24"/>
+          <w:szCs w:val="24"/>
+        </w:rPr>
+        <w:t>Waarom TinyUSB voor dit project?</w:t>
+      </w:r>
+    </w:p>
+    <w:p>
+      <w:r>
+        <w:t>- MIDI Class ingebouwd</w:t>
+      </w:r>
+    </w:p>
+    <w:p>
+      <w:r>
+        <w:t xml:space="preserve">- </w:t>
+      </w:r>
+      <w:r>
+        <w:t>Werkt automatisch met STM32 US</w:t>
+      </w:r>
+    </w:p>
+    <w:p>
+      <w:r>
+        <w:t>- Goeie documentatie met veel voorbeelden</w:t>
+      </w:r>
+    </w:p>
+    <w:p/>
+    <w:p/>
+    <w:p>
+      <w:pPr>
+        <w:rPr>
+          <w:b/>
+          <w:bCs/>
+          <w:sz w:val="32"/>
+          <w:szCs w:val="32"/>
+        </w:rPr>
+      </w:pPr>
+      <w:r>
+        <w:rPr>
+          <w:b/>
+          <w:bCs/>
+          <w:sz w:val="32"/>
+          <w:szCs w:val="32"/>
+        </w:rPr>
+        <w:t>TinyUSB in dit Project</w:t>
+      </w:r>
+    </w:p>
+    <w:p>
+      <w:pPr>
+        <w:rPr>
+          <w:b/>
+          <w:bCs/>
+        </w:rPr>
+      </w:pPr>
+      <w:r>
+        <w:rPr>
+          <w:b/>
+          <w:bCs/>
+        </w:rPr>
+        <w:t>Initialisatie (main.c):</w:t>
+      </w:r>
+    </w:p>
+    <w:p>
+      <w:r>
+        <w:t xml:space="preserve">   // TinyUSB initialiseren</w:t>
+      </w:r>
+    </w:p>
+    <w:p>
+      <w:r>
+        <w:t xml:space="preserve">   tusb_rhport_init_t dev_init = {</w:t>
+      </w:r>
+    </w:p>
+    <w:p>
+      <w:r>
+        <w:t xml:space="preserve">     .role  = TUSB_ROLE_DEVICE,</w:t>
+      </w:r>
+    </w:p>
+    <w:p>
+      <w:r>
+        <w:t xml:space="preserve">     .speed = TUSB_SPEED_AUTO</w:t>
+      </w:r>
+    </w:p>
+    <w:p>
+      <w:pPr>
+        <w:rPr>
+          <w:lang w:val="en-US"/>
+        </w:rPr>
+      </w:pPr>
+      <w:r>
+        <w:t xml:space="preserve">   </w:t>
+      </w:r>
+      <w:r>
+        <w:rPr>
+          <w:lang w:val="en-US"/>
+        </w:rPr>
+        <w:t>};</w:t>
+      </w:r>
+    </w:p>
+    <w:p>
+      <w:pPr>
+        <w:rPr>
+          <w:lang w:val="en-US"/>
+        </w:rPr>
+      </w:pPr>
+      <w:r>
+        <w:rPr>
+          <w:lang w:val="en-US"/>
+        </w:rPr>
+        <w:t xml:space="preserve">   tusb_init(BOARD_TUD_RHPORT, &amp;dev_init);</w:t>
+      </w:r>
+    </w:p>
+    <w:p>
+      <w:pPr>
+        <w:rPr>
+          <w:lang w:val="en-US"/>
+        </w:rPr>
+      </w:pPr>
+    </w:p>
+    <w:p>
+      <w:pPr>
+        <w:rPr>
+          <w:b/>
+          <w:bCs/>
+          <w:lang w:val="en-US"/>
+        </w:rPr>
+      </w:pPr>
+      <w:r>
+        <w:rPr>
+          <w:b/>
+          <w:bCs/>
+          <w:lang w:val="en-US"/>
+        </w:rPr>
+        <w:t>USB servicing (main loop):</w:t>
+      </w:r>
+    </w:p>
+    <w:p>
+      <w:pPr>
+        <w:rPr>
+          <w:lang w:val="en-US"/>
+        </w:rPr>
+      </w:pPr>
+      <w:r>
+        <w:rPr>
+          <w:lang w:val="en-US"/>
+        </w:rPr>
+        <w:t xml:space="preserve">   while (1) {</w:t>
+      </w:r>
+    </w:p>
+    <w:p>
+      <w:pPr>
+        <w:rPr>
+          <w:lang w:val="en-US"/>
+        </w:rPr>
+      </w:pPr>
+      <w:r>
+        <w:rPr>
+          <w:lang w:val="en-US"/>
+        </w:rPr>
+        <w:t xml:space="preserve">     tud_task();              // USB stack verwerken</w:t>
+      </w:r>
+    </w:p>
+    <w:p>
+      <w:pPr>
+        <w:rPr>
+          <w:lang w:val="en-US"/>
+        </w:rPr>
+      </w:pPr>
+      <w:r>
+        <w:rPr>
+          <w:lang w:val="en-US"/>
+        </w:rPr>
+        <w:t xml:space="preserve">     keypad_task();           // Matrix scannen</w:t>
+      </w:r>
+    </w:p>
+    <w:p>
+      <w:pPr>
+        <w:rPr>
+          <w:lang w:val="en-US"/>
+        </w:rPr>
+      </w:pPr>
+      <w:r>
+        <w:rPr>
+          <w:lang w:val="en-US"/>
+        </w:rPr>
+        <w:lastRenderedPageBreak/>
+        <w:t xml:space="preserve">     midi_task();             // Inkomende MIDI verwerken</w:t>
+      </w:r>
+    </w:p>
+    <w:p>
+      <w:r>
+        <w:rPr>
+          <w:lang w:val="en-US"/>
+        </w:rPr>
+        <w:t xml:space="preserve">   </w:t>
+      </w:r>
+      <w:r>
+        <w:t>}</w:t>
+      </w:r>
+    </w:p>
+    <w:p/>
+    <w:p/>
+    <w:p/>
+    <w:p>
+      <w:pPr>
+        <w:rPr>
+          <w:b/>
+          <w:bCs/>
+          <w:sz w:val="32"/>
+          <w:szCs w:val="32"/>
+        </w:rPr>
+      </w:pPr>
+      <w:r>
+        <w:rPr>
+          <w:b/>
+          <w:bCs/>
+          <w:sz w:val="32"/>
+          <w:szCs w:val="32"/>
+        </w:rPr>
+        <w:t>Dataflow: Knopdruk → MIDI</w:t>
+      </w:r>
+    </w:p>
+    <w:p>
+      <w:r>
+        <w:t xml:space="preserve">   1. Gebruiker drukt knop in</w:t>
+      </w:r>
+    </w:p>
+    <w:p>
+      <w:r>
+        <w:t xml:space="preserve">      ↓</w:t>
+      </w:r>
+    </w:p>
+    <w:p>
+      <w:r>
+        <w:t xml:space="preserve">   2. Knop vervang naar laag (contact maken)</w:t>
+      </w:r>
+    </w:p>
+    <w:p>
+      <w:pPr>
+        <w:rPr>
+          <w:lang w:val="it-IT"/>
+        </w:rPr>
+      </w:pPr>
+      <w:r>
+        <w:t xml:space="preserve">      </w:t>
+      </w:r>
+      <w:r>
+        <w:rPr>
+          <w:lang w:val="it-IT"/>
+        </w:rPr>
+        <w:t>↓</w:t>
+      </w:r>
+    </w:p>
+    <w:p>
+      <w:pPr>
+        <w:rPr>
+          <w:lang w:val="it-IT"/>
+        </w:rPr>
+      </w:pPr>
+      <w:r>
+        <w:rPr>
+          <w:lang w:val="it-IT"/>
+        </w:rPr>
+        <w:t xml:space="preserve">   3. keypad_scan() - Matrix scanning via SPI</w:t>
+      </w:r>
+    </w:p>
+    <w:p>
+      <w:r>
+        <w:rPr>
+          <w:lang w:val="it-IT"/>
+        </w:rPr>
+        <w:t xml:space="preserve">      </w:t>
+      </w:r>
+      <w:r>
+        <w:t>- Schrijf kolom laag naar MCP GPIOA</w:t>
+      </w:r>
+    </w:p>
+    <w:p>
+      <w:r>
+        <w:t xml:space="preserve">      - Lees rijen van MCP GPIOB</w:t>
+      </w:r>
+    </w:p>
+    <w:p>
+      <w:r>
+        <w:t xml:space="preserve">      - Controleer welke rij ook laag is</w:t>
+      </w:r>
+    </w:p>
+    <w:p>
+      <w:r>
+        <w:t xml:space="preserve">      ↓</w:t>
+      </w:r>
+    </w:p>
+    <w:p>
+      <w:r>
+        <w:t xml:space="preserve">   4. Debounce - 5 identieke scans nodig (100ms stabiliteit)</w:t>
+      </w:r>
+    </w:p>
+    <w:p>
+      <w:r>
+        <w:t xml:space="preserve">      ↓</w:t>
+      </w:r>
+    </w:p>
+    <w:p>
+      <w:r>
+        <w:t xml:space="preserve">   5. Toestandsverandering detecteren (1→0 = ingedrukt)</w:t>
+      </w:r>
+    </w:p>
+    <w:p>
+      <w:r>
+        <w:t xml:space="preserve">      ↓</w:t>
+      </w:r>
+    </w:p>
+    <w:p>
+      <w:r>
+        <w:t xml:space="preserve">   6. MIDI Note On bericht bouwen</w:t>
+      </w:r>
+    </w:p>
+    <w:p>
+      <w:pPr>
+        <w:rPr>
+          <w:lang w:val="en-US"/>
+        </w:rPr>
+      </w:pPr>
+      <w:r>
+        <w:t xml:space="preserve">      </w:t>
+      </w:r>
+      <w:r>
+        <w:rPr>
+          <w:lang w:val="en-US"/>
+        </w:rPr>
+        <w:t>- Status byte: 0x90 (Note On channel 0)</w:t>
+      </w:r>
+    </w:p>
+    <w:p>
+      <w:pPr>
+        <w:rPr>
+          <w:lang w:val="en-US"/>
+        </w:rPr>
+      </w:pPr>
+      <w:r>
+        <w:rPr>
+          <w:lang w:val="en-US"/>
+        </w:rPr>
+        <w:t xml:space="preserve">      - Data byte 1: Nootnummer (60-86)</w:t>
+      </w:r>
+    </w:p>
+    <w:p>
+      <w:pPr>
+        <w:rPr>
+          <w:lang w:val="en-US"/>
+        </w:rPr>
+      </w:pPr>
+      <w:r>
+        <w:rPr>
+          <w:lang w:val="en-US"/>
+        </w:rPr>
+        <w:t xml:space="preserve">      - Data byte 2: Velocity (127 - maximum)</w:t>
+      </w:r>
+    </w:p>
+    <w:p>
+      <w:pPr>
+        <w:rPr>
+          <w:lang w:val="en-US"/>
+        </w:rPr>
+      </w:pPr>
+      <w:r>
+        <w:rPr>
+          <w:lang w:val="en-US"/>
+        </w:rPr>
+        <w:t xml:space="preserve">      ↓</w:t>
+      </w:r>
+    </w:p>
+    <w:p>
+      <w:pPr>
+        <w:rPr>
+          <w:lang w:val="en-US"/>
+        </w:rPr>
+      </w:pPr>
+      <w:r>
+        <w:rPr>
+          <w:lang w:val="en-US"/>
+        </w:rPr>
+        <w:t xml:space="preserve">   7. tud_midi_packet_write() - Via USB naar computer</w:t>
+      </w:r>
+    </w:p>
+    <w:p>
+      <w:pPr>
+        <w:rPr>
+          <w:lang w:val="en-US"/>
+        </w:rPr>
+      </w:pPr>
+      <w:r>
+        <w:rPr>
+          <w:lang w:val="en-US"/>
+        </w:rPr>
+        <w:t xml:space="preserve">      ↓</w:t>
+      </w:r>
+    </w:p>
+    <w:p>
+      <w:pPr>
+        <w:rPr>
+          <w:lang w:val="en-US"/>
+        </w:rPr>
+      </w:pPr>
+      <w:r>
+        <w:rPr>
+          <w:lang w:val="en-US"/>
+        </w:rPr>
+        <w:t xml:space="preserve">   8. DAW/Synthesizer ontvangt MIDI-bericht</w:t>
+      </w:r>
+    </w:p>
+    <w:p>
+      <w:r>
+        <w:rPr>
+          <w:lang w:val="en-US"/>
+        </w:rPr>
+        <w:t xml:space="preserve">      </w:t>
+      </w:r>
+      <w:r>
+        <w:t>- Speelt sound af</w:t>
+      </w:r>
+    </w:p>
+    <w:p/>
+    <w:p/>
+    <w:p>
+      <w:pPr>
+        <w:rPr>
+          <w:b/>
+          <w:bCs/>
+          <w:sz w:val="36"/>
+          <w:szCs w:val="36"/>
+        </w:rPr>
+      </w:pPr>
+      <w:r>
+        <w:rPr>
+          <w:b/>
+          <w:bCs/>
+          <w:sz w:val="36"/>
+          <w:szCs w:val="36"/>
+        </w:rPr>
+        <w:lastRenderedPageBreak/>
+        <w:t>MCP23S17 Initialisatie</w:t>
+      </w:r>
+    </w:p>
+    <w:p>
+      <w:r>
+        <w:rPr>
+          <w:b/>
+          <w:bCs/>
+        </w:rPr>
+        <w:t>Wat doet dit?</w:t>
+      </w:r>
+      <w:r>
+        <w:t xml:space="preserve"> Configureert GPIOA als outputs (kolommen aansturen) en</w:t>
+      </w:r>
+    </w:p>
+    <w:p>
+      <w:r>
+        <w:t>GPIOB als inputs met pull-ups (rijen lezen).</w:t>
+      </w:r>
+    </w:p>
+    <w:p>
+      <w:r>
+        <w:t xml:space="preserve">   static void mcp23s17_init(void)</w:t>
+      </w:r>
+    </w:p>
+    <w:p>
+      <w:r>
+        <w:t xml:space="preserve">   {</w:t>
+      </w:r>
+    </w:p>
+    <w:p>
+      <w:r>
+        <w:t xml:space="preserve">     // GPIOA = kolommen (outputs)</w:t>
+      </w:r>
+    </w:p>
+    <w:p>
+      <w:pPr>
+        <w:rPr>
+          <w:lang w:val="en-US"/>
+        </w:rPr>
+      </w:pPr>
+      <w:r>
+        <w:t xml:space="preserve">     </w:t>
+      </w:r>
+      <w:r>
+        <w:rPr>
+          <w:lang w:val="en-US"/>
+        </w:rPr>
+        <w:t>mcp23s17_write_reg(MCP_IODIRA, 0x00);    // 0=output, 1=input</w:t>
+      </w:r>
+    </w:p>
+    <w:p>
+      <w:pPr>
+        <w:rPr>
+          <w:lang w:val="en-US"/>
+        </w:rPr>
+      </w:pPr>
+      <w:r>
+        <w:rPr>
+          <w:lang w:val="en-US"/>
+        </w:rPr>
+        <w:t xml:space="preserve">     mcp23s17_write_reg(MCP_GPPUA,  0x00);    // Geen pull-ups op outputs</w:t>
+      </w:r>
+    </w:p>
+    <w:p>
+      <w:pPr>
+        <w:rPr>
+          <w:lang w:val="en-US"/>
+        </w:rPr>
+      </w:pPr>
+    </w:p>
+    <w:p>
+      <w:pPr>
+        <w:rPr>
+          <w:lang w:val="en-US"/>
+        </w:rPr>
+      </w:pPr>
+      <w:r>
+        <w:rPr>
+          <w:lang w:val="en-US"/>
+        </w:rPr>
+        <w:t xml:space="preserve">     // GPIOB = rijen (inputs met pull-ups)</w:t>
+      </w:r>
+    </w:p>
+    <w:p>
+      <w:r>
+        <w:rPr>
+          <w:lang w:val="en-US"/>
+        </w:rPr>
+        <w:t xml:space="preserve">     </w:t>
+      </w:r>
+      <w:r>
+        <w:t>mcp23s17_write_reg(MCP_IODIRB, 0x0F);    // 0x0F = alle 4 rijen als inputs</w:t>
+      </w:r>
+    </w:p>
+    <w:p>
+      <w:r>
+        <w:t xml:space="preserve">     mcp23s17_write_reg(MCP_GPPUB,  0x0F);    // 0x0F = pull-ups ingeschakeld</w:t>
+      </w:r>
+    </w:p>
+    <w:p>
+      <w:r>
+        <w:t xml:space="preserve">     </w:t>
+      </w:r>
+    </w:p>
+    <w:p>
+      <w:r>
+        <w:t xml:space="preserve">     // Alle kolommen initieel hoog (inactief)</w:t>
+      </w:r>
+    </w:p>
+    <w:p>
+      <w:pPr>
+        <w:rPr>
+          <w:lang w:val="en-US"/>
+        </w:rPr>
+      </w:pPr>
+      <w:r>
+        <w:t xml:space="preserve">     </w:t>
+      </w:r>
+      <w:r>
+        <w:rPr>
+          <w:lang w:val="en-US"/>
+        </w:rPr>
+        <w:t>mcp23s17_write_reg(MCP_REG_GPIOA, 0x0F);</w:t>
+      </w:r>
+    </w:p>
+    <w:p>
+      <w:pPr>
+        <w:rPr>
+          <w:lang w:val="en-US"/>
+        </w:rPr>
+      </w:pPr>
+    </w:p>
+    <w:p>
+      <w:pPr>
+        <w:rPr>
+          <w:lang w:val="en-US"/>
+        </w:rPr>
+      </w:pPr>
+      <w:r>
+        <w:rPr>
+          <w:lang w:val="en-US"/>
+        </w:rPr>
+        <w:t xml:space="preserve">     // Initialiseer state arrays</w:t>
+      </w:r>
+    </w:p>
+    <w:p>
+      <w:r>
+        <w:rPr>
+          <w:lang w:val="en-US"/>
+        </w:rPr>
+        <w:t xml:space="preserve">     </w:t>
+      </w:r>
+      <w:r>
+        <w:t>for (int i = 0; i &lt; 4; i++) {</w:t>
+      </w:r>
+    </w:p>
+    <w:p>
+      <w:r>
+        <w:t xml:space="preserve">       keypad_state[i]      = 0x0F;   // Alle knoppen los (hoog = niet ingedrukt)</w:t>
+      </w:r>
+    </w:p>
+    <w:p>
+      <w:pPr>
+        <w:rPr>
+          <w:lang w:val="en-US"/>
+        </w:rPr>
+      </w:pPr>
+      <w:r>
+        <w:t xml:space="preserve">       </w:t>
+      </w:r>
+      <w:r>
+        <w:rPr>
+          <w:lang w:val="en-US"/>
+        </w:rPr>
+        <w:t>keypad_prev[i]       = 0x0F;   // Vorige toestand</w:t>
+      </w:r>
+    </w:p>
+    <w:p>
+      <w:pPr>
+        <w:rPr>
+          <w:lang w:val="en-US"/>
+        </w:rPr>
+      </w:pPr>
+      <w:r>
+        <w:rPr>
+          <w:lang w:val="en-US"/>
+        </w:rPr>
+        <w:t xml:space="preserve">       keypad_candidate[i]  = 0x0F;   // Debounce kandidaat</w:t>
+      </w:r>
+    </w:p>
+    <w:p>
+      <w:pPr>
+        <w:rPr>
+          <w:lang w:val="en-US"/>
+        </w:rPr>
+      </w:pPr>
+      <w:r>
+        <w:rPr>
+          <w:lang w:val="en-US"/>
+        </w:rPr>
+        <w:t xml:space="preserve">       keypad_stable_cnt[i] = 0;      // Debounce teller</w:t>
+      </w:r>
+    </w:p>
+    <w:p>
+      <w:pPr>
+        <w:rPr>
+          <w:lang w:val="it-IT"/>
+        </w:rPr>
+      </w:pPr>
+      <w:r>
+        <w:rPr>
+          <w:lang w:val="en-US"/>
+        </w:rPr>
+        <w:t xml:space="preserve">     </w:t>
+      </w:r>
+      <w:r>
+        <w:rPr>
+          <w:lang w:val="it-IT"/>
+        </w:rPr>
+        <w:t>}</w:t>
+      </w:r>
+    </w:p>
+    <w:p>
+      <w:pPr>
+        <w:rPr>
+          <w:lang w:val="it-IT"/>
+        </w:rPr>
+      </w:pPr>
+      <w:r>
+        <w:rPr>
+          <w:lang w:val="it-IT"/>
+        </w:rPr>
+        <w:t xml:space="preserve">   }</w:t>
+      </w:r>
+    </w:p>
+    <w:p>
+      <w:pPr>
+        <w:rPr>
+          <w:lang w:val="it-IT"/>
+        </w:rPr>
+      </w:pPr>
+    </w:p>
+    <w:p>
+      <w:pPr>
+        <w:rPr>
+          <w:lang w:val="it-IT"/>
+        </w:rPr>
+      </w:pPr>
+      <w:r>
+        <w:rPr>
+          <w:b/>
+          <w:bCs/>
+          <w:lang w:val="it-IT"/>
+        </w:rPr>
+        <w:t>Registers uitgelegd:</w:t>
+      </w:r>
+      <w:r>
+        <w:rPr>
+          <w:lang w:val="it-IT"/>
+        </w:rPr>
+        <w:t xml:space="preserve"> - ``IODIRA (0x00)`` - I/O Direction Register A</w:t>
+      </w:r>
+    </w:p>
+    <w:p>
+      <w:r>
+        <w:t>- Bit = 0 → Output (we sturen dit aan) - Bit = 1 → Input (we lezen dit)</w:t>
+      </w:r>
+    </w:p>
+    <w:p/>
+    <w:p>
+      <w:pPr>
+        <w:rPr>
+          <w:lang w:val="en-US"/>
+        </w:rPr>
+      </w:pPr>
+      <w:r>
+        <w:rPr>
+          <w:lang w:val="en-US"/>
+        </w:rPr>
+        <w:t>- ``GPPUA (0x0C)`` - GPIO Pull-Up Resistor A</w:t>
+      </w:r>
+    </w:p>
+    <w:p>
+      <w:pPr>
+        <w:rPr>
+          <w:lang w:val="en-US"/>
+        </w:rPr>
+      </w:pPr>
+      <w:r>
+        <w:rPr>
+          <w:lang w:val="en-US"/>
+        </w:rPr>
+        <w:t xml:space="preserve">  - Bit = 0 → Geen internal pull-up</w:t>
+      </w:r>
+    </w:p>
+    <w:p>
+      <w:pPr>
+        <w:rPr>
+          <w:lang w:val="en-US"/>
+        </w:rPr>
+      </w:pPr>
+      <w:r>
+        <w:rPr>
+          <w:lang w:val="en-US"/>
+        </w:rPr>
+        <w:t xml:space="preserve">  - Bit = 1 → 100k</w:t>
+      </w:r>
+      <w:r>
+        <w:t>Ω</w:t>
+      </w:r>
+      <w:r>
+        <w:rPr>
+          <w:lang w:val="en-US"/>
+        </w:rPr>
+        <w:t xml:space="preserve"> internal pull-up</w:t>
+      </w:r>
+    </w:p>
+    <w:p>
+      <w:pPr>
+        <w:rPr>
+          <w:lang w:val="en-US"/>
+        </w:rPr>
+      </w:pPr>
+    </w:p>
+    <w:p>
+      <w:pPr>
+        <w:rPr>
+          <w:lang w:val="en-US"/>
+        </w:rPr>
+      </w:pPr>
+    </w:p>
+    <w:p>
+      <w:r>
+        <w:rPr>
+          <w:b/>
+          <w:bCs/>
+          <w:sz w:val="36"/>
+          <w:szCs w:val="36"/>
+        </w:rPr>
+        <w:t>Matrix Scanning met Debouncing</w:t>
+      </w:r>
+    </w:p>
+    <w:p>
+      <w:r>
+        <w:rPr>
+          <w:b/>
+          <w:bCs/>
+        </w:rPr>
+        <w:t>Wat doet dit?</w:t>
+      </w:r>
+      <w:r>
+        <w:t xml:space="preserve"> Scant de 4x4 matrix elke kolom, leest welke rijen</w:t>
+      </w:r>
+      <w:r>
+        <w:t xml:space="preserve"> </w:t>
+      </w:r>
+      <w:r>
+        <w:t>hoog/laag zijn, en filtert ruis via debouncing.</w:t>
+      </w:r>
+    </w:p>
+    <w:p/>
+    <w:p>
+      <w:pPr>
+        <w:rPr>
+          <w:lang w:val="en-US"/>
+        </w:rPr>
+      </w:pPr>
+      <w:r>
+        <w:t xml:space="preserve">   </w:t>
+      </w:r>
+      <w:r>
+        <w:rPr>
+          <w:lang w:val="en-US"/>
+        </w:rPr>
+        <w:t>static void keypad_scan(void)</w:t>
+      </w:r>
+    </w:p>
+    <w:p>
+      <w:pPr>
+        <w:rPr>
+          <w:lang w:val="en-US"/>
+        </w:rPr>
+      </w:pPr>
+      <w:r>
+        <w:rPr>
+          <w:lang w:val="en-US"/>
+        </w:rPr>
+        <w:t xml:space="preserve">   </w:t>
+      </w:r>
+      <w:r>
+        <w:rPr>
+          <w:lang w:val="en-US"/>
+        </w:rPr>
+        <w:t>{</w:t>
+      </w:r>
+    </w:p>
+    <w:p>
+      <w:pPr>
+        <w:rPr>
+          <w:lang w:val="en-US"/>
+        </w:rPr>
+      </w:pPr>
+      <w:r>
+        <w:rPr>
+          <w:lang w:val="en-US"/>
+        </w:rPr>
+        <w:t xml:space="preserve">     // Loop door elke kolom (0-3)</w:t>
+      </w:r>
+    </w:p>
+    <w:p>
+      <w:pPr>
+        <w:rPr>
+          <w:lang w:val="en-US"/>
+        </w:rPr>
+      </w:pPr>
+      <w:r>
+        <w:rPr>
+          <w:lang w:val="en-US"/>
+        </w:rPr>
+        <w:t xml:space="preserve">     for (int row = 0; row &lt; 4; row++)</w:t>
+      </w:r>
+    </w:p>
+    <w:p>
+      <w:pPr>
+        <w:rPr>
+          <w:lang w:val="en-US"/>
+        </w:rPr>
+      </w:pPr>
+      <w:r>
+        <w:rPr>
+          <w:lang w:val="en-US"/>
+        </w:rPr>
+        <w:t xml:space="preserve">     {</w:t>
+      </w:r>
+    </w:p>
+    <w:p>
+      <w:pPr>
+        <w:rPr>
+          <w:lang w:val="en-US"/>
+        </w:rPr>
+      </w:pPr>
+      <w:r>
+        <w:rPr>
+          <w:lang w:val="en-US"/>
+        </w:rPr>
+        <w:t xml:space="preserve">       // Drijf kolom 'row' omlaag, rest omhoog</w:t>
+      </w:r>
+    </w:p>
+    <w:p>
+      <w:r>
+        <w:rPr>
+          <w:lang w:val="en-US"/>
+        </w:rPr>
+        <w:t xml:space="preserve">       </w:t>
+      </w:r>
+      <w:r>
+        <w:t>// Voorbeeld: row=0 → 0b1110 = 0xE → alleen kolom 0 laag</w:t>
+      </w:r>
+    </w:p>
+    <w:p>
+      <w:pPr>
+        <w:rPr>
+          <w:lang w:val="en-US"/>
+        </w:rPr>
+      </w:pPr>
+      <w:r>
+        <w:t xml:space="preserve">       </w:t>
+      </w:r>
+      <w:r>
+        <w:rPr>
+          <w:lang w:val="en-US"/>
+        </w:rPr>
+        <w:t>uint8_t row_pattern = ~(1 &lt;&lt; row) &amp; 0x0F;</w:t>
+      </w:r>
+    </w:p>
+    <w:p>
+      <w:pPr>
+        <w:rPr>
+          <w:lang w:val="en-US"/>
+        </w:rPr>
+      </w:pPr>
+      <w:r>
+        <w:rPr>
+          <w:lang w:val="en-US"/>
+        </w:rPr>
+        <w:t xml:space="preserve">       mcp23s17_write_reg(MCP_REG_GPIOA, row_pattern);</w:t>
+      </w:r>
+    </w:p>
+    <w:p>
+      <w:pPr>
+        <w:rPr>
+          <w:lang w:val="en-US"/>
+        </w:rPr>
+      </w:pPr>
+    </w:p>
+    <w:p>
+      <w:r>
+        <w:rPr>
+          <w:lang w:val="en-US"/>
+        </w:rPr>
+        <w:t xml:space="preserve">       </w:t>
+      </w:r>
+      <w:r>
+        <w:t>// Lees rijen twee keer (debounce verificatie)</w:t>
+      </w:r>
+    </w:p>
+    <w:p>
+      <w:pPr>
+        <w:rPr>
+          <w:lang w:val="en-US"/>
+        </w:rPr>
+      </w:pPr>
+      <w:r>
+        <w:t xml:space="preserve">       </w:t>
+      </w:r>
+      <w:r>
+        <w:rPr>
+          <w:lang w:val="en-US"/>
+        </w:rPr>
+        <w:t>uint8_t read1 = mcp23s17_read_reg(MCP_REG_GPIOB) &amp; 0x0F;</w:t>
+      </w:r>
+    </w:p>
+    <w:p>
+      <w:pPr>
+        <w:rPr>
+          <w:lang w:val="en-US"/>
+        </w:rPr>
+      </w:pPr>
+      <w:r>
+        <w:rPr>
+          <w:lang w:val="en-US"/>
+        </w:rPr>
+        <w:t xml:space="preserve">       uint8_t read2 = mcp23s17_read_reg(MCP_REG_GPIOB) &amp; 0x0F;</w:t>
+      </w:r>
+    </w:p>
+    <w:p>
+      <w:pPr>
+        <w:rPr>
+          <w:lang w:val="en-US"/>
+        </w:rPr>
+      </w:pPr>
+    </w:p>
+    <w:p>
+      <w:r>
+        <w:rPr>
+          <w:lang w:val="en-US"/>
+        </w:rPr>
+        <w:t xml:space="preserve">       </w:t>
+      </w:r>
+      <w:r>
+        <w:t>// Beide aflezingen identiek? (geen ruis)</w:t>
+      </w:r>
+    </w:p>
+    <w:p>
+      <w:pPr>
+        <w:rPr>
+          <w:lang w:val="en-US"/>
+        </w:rPr>
+      </w:pPr>
+      <w:r>
+        <w:t xml:space="preserve">       </w:t>
+      </w:r>
+      <w:r>
+        <w:rPr>
+          <w:lang w:val="en-US"/>
+        </w:rPr>
+        <w:t>if (read1 != read2) {</w:t>
+      </w:r>
+    </w:p>
+    <w:p>
+      <w:pPr>
+        <w:rPr>
+          <w:lang w:val="en-US"/>
+        </w:rPr>
+      </w:pPr>
+      <w:r>
+        <w:rPr>
+          <w:lang w:val="en-US"/>
+        </w:rPr>
+        <w:t xml:space="preserve">         keypad_stable_cnt[row] = 0;  // Reset debounce teller</w:t>
+      </w:r>
+    </w:p>
+    <w:p>
+      <w:r>
+        <w:rPr>
+          <w:lang w:val="en-US"/>
+        </w:rPr>
+        <w:t xml:space="preserve">         </w:t>
+      </w:r>
+      <w:r>
+        <w:t>continue;</w:t>
+      </w:r>
+    </w:p>
+    <w:p>
+      <w:r>
+        <w:t xml:space="preserve">       }</w:t>
+      </w:r>
+    </w:p>
+    <w:p/>
+    <w:p>
+      <w:r>
+        <w:t xml:space="preserve">       // Dezelfde als kandidaat?</w:t>
+      </w:r>
+    </w:p>
+    <w:p>
+      <w:r>
+        <w:t xml:space="preserve">       if (read1 == keypad_candidate[row]) {</w:t>
+      </w:r>
+    </w:p>
+    <w:p>
+      <w:r>
+        <w:t xml:space="preserve">         // Teller verhogen totdat DEBOUNCE_COUNT (5) bereikt</w:t>
+      </w:r>
+    </w:p>
+    <w:p>
+      <w:pPr>
+        <w:rPr>
+          <w:lang w:val="en-US"/>
+        </w:rPr>
+      </w:pPr>
+      <w:r>
+        <w:t xml:space="preserve">         </w:t>
+      </w:r>
+      <w:r>
+        <w:rPr>
+          <w:lang w:val="en-US"/>
+        </w:rPr>
+        <w:t>if (keypad_stable_cnt[row] &lt; DEBOUNCE_COUNT)</w:t>
+      </w:r>
+    </w:p>
+    <w:p>
+      <w:r>
+        <w:rPr>
+          <w:lang w:val="en-US"/>
+        </w:rPr>
+        <w:t xml:space="preserve">           </w:t>
+      </w:r>
+      <w:r>
+        <w:t>keypad_stable_cnt[row]++;</w:t>
+      </w:r>
+    </w:p>
+    <w:p>
+      <w:r>
+        <w:lastRenderedPageBreak/>
+        <w:t xml:space="preserve">         </w:t>
+      </w:r>
+    </w:p>
+    <w:p>
+      <w:r>
+        <w:t xml:space="preserve">         // Na 5 identieke scans: accepteer als stabiele toestand</w:t>
+      </w:r>
+    </w:p>
+    <w:p>
+      <w:pPr>
+        <w:rPr>
+          <w:lang w:val="en-US"/>
+        </w:rPr>
+      </w:pPr>
+      <w:r>
+        <w:t xml:space="preserve">         </w:t>
+      </w:r>
+      <w:r>
+        <w:rPr>
+          <w:lang w:val="en-US"/>
+        </w:rPr>
+        <w:t>if (keypad_stable_cnt[row] &gt;= DEBOUNCE_COUNT)</w:t>
+      </w:r>
+    </w:p>
+    <w:p>
+      <w:pPr>
+        <w:rPr>
+          <w:lang w:val="en-US"/>
+        </w:rPr>
+      </w:pPr>
+      <w:r>
+        <w:rPr>
+          <w:lang w:val="en-US"/>
+        </w:rPr>
+        <w:t xml:space="preserve">           keypad_state[row] = read1;</w:t>
+      </w:r>
+    </w:p>
+    <w:p>
+      <w:pPr>
+        <w:rPr>
+          <w:lang w:val="en-US"/>
+        </w:rPr>
+      </w:pPr>
+      <w:r>
+        <w:rPr>
+          <w:lang w:val="en-US"/>
+        </w:rPr>
+        <w:t xml:space="preserve">       } else {</w:t>
+      </w:r>
+    </w:p>
+    <w:p>
+      <w:r>
+        <w:rPr>
+          <w:lang w:val="en-US"/>
+        </w:rPr>
+        <w:t xml:space="preserve">         </w:t>
+      </w:r>
+      <w:r>
+        <w:t>// Nieuwe kandidaat waarde</w:t>
+      </w:r>
+    </w:p>
+    <w:p>
+      <w:r>
+        <w:t xml:space="preserve">         keypad_candidate[row]  = read1;</w:t>
+      </w:r>
+    </w:p>
+    <w:p>
+      <w:pPr>
+        <w:rPr>
+          <w:lang w:val="en-US"/>
+        </w:rPr>
+      </w:pPr>
+      <w:r>
+        <w:t xml:space="preserve">         </w:t>
+      </w:r>
+      <w:r>
+        <w:rPr>
+          <w:lang w:val="en-US"/>
+        </w:rPr>
+        <w:t>keypad_stable_cnt[row] = 1;  // Restart teller</w:t>
+      </w:r>
+    </w:p>
+    <w:p>
+      <w:r>
+        <w:rPr>
+          <w:lang w:val="en-US"/>
+        </w:rPr>
+        <w:t xml:space="preserve">       </w:t>
+      </w:r>
+      <w:r>
+        <w:t>}</w:t>
+      </w:r>
+    </w:p>
+    <w:p>
+      <w:r>
+        <w:t xml:space="preserve">     }</w:t>
+      </w:r>
+    </w:p>
+    <w:p/>
+    <w:p>
+      <w:r>
+        <w:t xml:space="preserve">     // Zet alle kolommen terug hoog (inactief)</w:t>
+      </w:r>
+    </w:p>
+    <w:p>
+      <w:pPr>
+        <w:rPr>
+          <w:lang w:val="en-US"/>
+        </w:rPr>
+      </w:pPr>
+      <w:r>
+        <w:t xml:space="preserve">     </w:t>
+      </w:r>
+      <w:r>
+        <w:rPr>
+          <w:lang w:val="en-US"/>
+        </w:rPr>
+        <w:t>mcp23s17_write_reg(MCP_REG_GPIOA, 0x0F);</w:t>
+      </w:r>
+    </w:p>
+    <w:p>
+      <w:pPr>
+        <w:rPr>
+          <w:lang w:val="en-US"/>
+        </w:rPr>
+      </w:pPr>
+      <w:r>
+        <w:rPr>
+          <w:lang w:val="en-US"/>
+        </w:rPr>
+        <w:t xml:space="preserve">   }</w:t>
+      </w:r>
+    </w:p>
+    <w:p>
+      <w:pPr>
+        <w:rPr>
+          <w:lang w:val="en-US"/>
+        </w:rPr>
+      </w:pPr>
+    </w:p>
+    <w:p>
+      <w:pPr>
+        <w:rPr>
+          <w:lang w:val="en-US"/>
+        </w:rPr>
+      </w:pPr>
+      <w:r>
+        <w:rPr>
+          <w:lang w:val="en-US"/>
+        </w:rPr>
+        <w:t>**Debounce Logica:**</w:t>
+      </w:r>
+    </w:p>
+    <w:p>
+      <w:pPr>
+        <w:rPr>
+          <w:lang w:val="en-US"/>
+        </w:rPr>
+      </w:pPr>
+    </w:p>
+    <w:p>
+      <w:r>
+        <w:t>::</w:t>
+      </w:r>
+    </w:p>
+    <w:p/>
+    <w:p>
+      <w:r>
+        <w:t xml:space="preserve">   Tijd:      </w:t>
+      </w:r>
+      <w:r>
+        <w:t xml:space="preserve">         </w:t>
+      </w:r>
+      <w:r>
+        <w:t xml:space="preserve">  0ms   </w:t>
+      </w:r>
+      <w:r>
+        <w:t xml:space="preserve"> </w:t>
+      </w:r>
+      <w:r>
+        <w:t>20ms  40ms  60ms  80ms  100ms  120ms</w:t>
+      </w:r>
+    </w:p>
+    <w:p>
+      <w:r>
+        <w:t xml:space="preserve">                  </w:t>
+      </w:r>
+      <w:r>
+        <w:t xml:space="preserve">      </w:t>
+      </w:r>
+      <w:r>
+        <w:t xml:space="preserve">    |  </w:t>
+      </w:r>
+      <w:r>
+        <w:t xml:space="preserve">     </w:t>
+      </w:r>
+      <w:r>
+        <w:t xml:space="preserve">  </w:t>
+      </w:r>
+      <w:r>
+        <w:t xml:space="preserve"> </w:t>
+      </w:r>
+      <w:r>
+        <w:t xml:space="preserve"> |  </w:t>
+      </w:r>
+      <w:r>
+        <w:t xml:space="preserve">        </w:t>
+      </w:r>
+      <w:r>
+        <w:t xml:space="preserve">   |   </w:t>
+      </w:r>
+      <w:r>
+        <w:t xml:space="preserve">        </w:t>
+      </w:r>
+      <w:r>
+        <w:t xml:space="preserve">  | </w:t>
+      </w:r>
+      <w:r>
+        <w:t xml:space="preserve">       </w:t>
+      </w:r>
+      <w:r>
+        <w:t xml:space="preserve">    |   </w:t>
+      </w:r>
+      <w:r>
+        <w:t xml:space="preserve">       </w:t>
+      </w:r>
+      <w:r>
+        <w:t xml:space="preserve">   |</w:t>
+      </w:r>
+      <w:r>
+        <w:t xml:space="preserve">           </w:t>
+      </w:r>
+      <w:r>
+        <w:t xml:space="preserve">  </w:t>
+      </w:r>
+      <w:r>
+        <w:t xml:space="preserve"> </w:t>
+      </w:r>
+      <w:r>
+        <w:t xml:space="preserve"> |</w:t>
+      </w:r>
+    </w:p>
+    <w:p>
+      <w:r>
+        <w:t xml:space="preserve">   Raw:        </w:t>
+      </w:r>
+      <w:r>
+        <w:t xml:space="preserve">       </w:t>
+      </w:r>
+      <w:r>
+        <w:t xml:space="preserve"> 1→0   </w:t>
+      </w:r>
+      <w:r>
+        <w:t xml:space="preserve">   </w:t>
+      </w:r>
+      <w:r>
+        <w:t xml:space="preserve">0→1 </w:t>
+      </w:r>
+      <w:r>
+        <w:t xml:space="preserve">       </w:t>
+      </w:r>
+      <w:r>
+        <w:t xml:space="preserve"> 0    </w:t>
+      </w:r>
+      <w:r>
+        <w:t xml:space="preserve">      </w:t>
+      </w:r>
+      <w:r>
+        <w:t xml:space="preserve"> 0   </w:t>
+      </w:r>
+      <w:r>
+        <w:t xml:space="preserve">      </w:t>
+      </w:r>
+      <w:r>
+        <w:t xml:space="preserve">  0    </w:t>
+      </w:r>
+      <w:r>
+        <w:t xml:space="preserve">        </w:t>
+      </w:r>
+      <w:r>
+        <w:t xml:space="preserve"> 0     </w:t>
+      </w:r>
+      <w:r>
+        <w:t xml:space="preserve">       </w:t>
+      </w:r>
+      <w:r>
+        <w:t xml:space="preserve"> 0</w:t>
+      </w:r>
+    </w:p>
+    <w:p>
+      <w:r>
+        <w:t xml:space="preserve">   Candidate:  </w:t>
+      </w:r>
+      <w:r>
+        <w:t xml:space="preserve">   </w:t>
+      </w:r>
+      <w:r>
+        <w:t xml:space="preserve"> X    </w:t>
+      </w:r>
+      <w:r>
+        <w:t xml:space="preserve">       </w:t>
+      </w:r>
+      <w:r>
+        <w:t xml:space="preserve"> 1</w:t>
+      </w:r>
+      <w:r>
+        <w:t xml:space="preserve">      </w:t>
+      </w:r>
+      <w:r>
+        <w:t xml:space="preserve">     0   </w:t>
+      </w:r>
+      <w:r>
+        <w:t xml:space="preserve">      </w:t>
+      </w:r>
+      <w:r>
+        <w:t xml:space="preserve">  0 </w:t>
+      </w:r>
+      <w:r>
+        <w:t xml:space="preserve">      </w:t>
+      </w:r>
+      <w:r>
+        <w:t xml:space="preserve">    0   </w:t>
+      </w:r>
+      <w:r>
+        <w:t xml:space="preserve">        </w:t>
+      </w:r>
+      <w:r>
+        <w:t xml:space="preserve">  0  </w:t>
+      </w:r>
+      <w:r>
+        <w:t xml:space="preserve">     </w:t>
+      </w:r>
+      <w:r>
+        <w:t xml:space="preserve">   </w:t>
+      </w:r>
+      <w:r>
+        <w:t xml:space="preserve">  </w:t>
+      </w:r>
+      <w:r>
+        <w:t xml:space="preserve"> 0</w:t>
+      </w:r>
+    </w:p>
+    <w:p>
+      <w:r>
+        <w:t xml:space="preserve">   Cnt:       </w:t>
+      </w:r>
+      <w:r>
+        <w:t xml:space="preserve">         </w:t>
+      </w:r>
+      <w:r>
+        <w:t xml:space="preserve">  </w:t>
+      </w:r>
+      <w:r>
+        <w:t xml:space="preserve">  0   </w:t>
+      </w:r>
+      <w:r>
+        <w:t xml:space="preserve">        </w:t>
+      </w:r>
+      <w:r>
+        <w:t xml:space="preserve">  1   </w:t>
+      </w:r>
+      <w:r>
+        <w:t xml:space="preserve">      </w:t>
+      </w:r>
+      <w:r>
+        <w:t xml:space="preserve">  1  </w:t>
+      </w:r>
+      <w:r>
+        <w:t xml:space="preserve">      </w:t>
+      </w:r>
+      <w:r>
+        <w:t xml:space="preserve">   2  </w:t>
+      </w:r>
+      <w:r>
+        <w:t xml:space="preserve">      </w:t>
+      </w:r>
+      <w:r>
+        <w:t xml:space="preserve">   3  </w:t>
+      </w:r>
+      <w:r>
+        <w:t xml:space="preserve">        </w:t>
+      </w:r>
+      <w:r>
+        <w:t xml:space="preserve">   4    </w:t>
+      </w:r>
+      <w:r>
+        <w:t xml:space="preserve"> </w:t>
+      </w:r>
+      <w:r>
+        <w:t xml:space="preserve">  </w:t>
+      </w:r>
+      <w:r>
+        <w:t xml:space="preserve">      </w:t>
+      </w:r>
+      <w:r>
+        <w:t>5</w:t>
+      </w:r>
+    </w:p>
+    <w:p>
+      <w:r>
+        <w:t xml:space="preserve">   State:     </w:t>
+      </w:r>
+      <w:r>
+        <w:t xml:space="preserve">       </w:t>
+      </w:r>
+      <w:r>
+        <w:t xml:space="preserve">  </w:t>
+      </w:r>
+      <w:r>
+        <w:t xml:space="preserve"> </w:t>
+      </w:r>
+      <w:r>
+        <w:t xml:space="preserve">  1     </w:t>
+      </w:r>
+      <w:r>
+        <w:t xml:space="preserve">       </w:t>
+      </w:r>
+      <w:r>
+        <w:t xml:space="preserve">1   </w:t>
+      </w:r>
+      <w:r>
+        <w:t xml:space="preserve">       </w:t>
+      </w:r>
+      <w:r>
+        <w:t xml:space="preserve">  1    </w:t>
+      </w:r>
+      <w:r>
+        <w:t xml:space="preserve">      </w:t>
+      </w:r>
+      <w:r>
+        <w:t xml:space="preserve"> 1   </w:t>
+      </w:r>
+      <w:r>
+        <w:t xml:space="preserve">      </w:t>
+      </w:r>
+      <w:r>
+        <w:t xml:space="preserve">  1  </w:t>
+      </w:r>
+      <w:r>
+        <w:t xml:space="preserve">     </w:t>
+      </w:r>
+      <w:r>
+        <w:t xml:space="preserve">   1→0   </w:t>
+      </w:r>
+      <w:r>
+        <w:t xml:space="preserve">      </w:t>
+      </w:r>
+      <w:r>
+        <w:t xml:space="preserve"> 0</w:t>
+      </w:r>
+    </w:p>
+    <w:p/>
+    <w:p>
+      <w:r>
+        <w:t xml:space="preserve">   Acceptatie gebeurt na 5×20ms = 100ms stabiliteit</w:t>
+      </w:r>
+    </w:p>
+    <w:p>
+      <w:r>
+        <w:t xml:space="preserve">   5 identieke waarden = vertrouwen dat het geen ruis is</w:t>
+      </w:r>
+      <w:r>
         <w:t>.</w:t>
       </w:r>
     </w:p>
-    <w:p>
-      <w:pPr>
-        <w:rPr>
-          <w:lang w:val="nl-NL"/>
-        </w:rPr>
-      </w:pPr>
-    </w:p>
-    <w:p>
-      <w:pPr>
-        <w:rPr>
-          <w:lang w:val="nl-NL"/>
-        </w:rPr>
-      </w:pPr>
-    </w:p>
-    <w:p>
-      <w:pPr>
-        <w:rPr>
-          <w:lang w:val="nl-NL"/>
-        </w:rPr>
-      </w:pPr>
-    </w:p>
-    <w:p>
-      <w:pPr>
-        <w:rPr>
-          <w:lang w:val="nl-NL"/>
-        </w:rPr>
-      </w:pPr>
-    </w:p>
-    <w:p>
-      <w:pPr>
-        <w:rPr>
-          <w:lang w:val="nl-NL"/>
-        </w:rPr>
-      </w:pPr>
-    </w:p>
-    <w:p>
-      <w:pPr>
-        <w:rPr>
-          <w:lang w:val="nl-NL"/>
-        </w:rPr>
-      </w:pPr>
-    </w:p>
+    <w:p/>
+    <w:p/>
+    <w:p>
+      <w:pPr>
+        <w:rPr>
+          <w:b/>
+          <w:bCs/>
+          <w:sz w:val="36"/>
+          <w:szCs w:val="36"/>
+        </w:rPr>
+      </w:pPr>
+      <w:r>
+        <w:rPr>
+          <w:b/>
+          <w:bCs/>
+          <w:sz w:val="36"/>
+          <w:szCs w:val="36"/>
+        </w:rPr>
+        <w:t>MIDI Packet Structuur:</w:t>
+      </w:r>
+    </w:p>
+    <w:p/>
+    <w:p>
+      <w:r>
+        <w:t>Byte Naam        Waarde Betekenis</w:t>
+      </w:r>
+    </w:p>
+    <w:p>
+      <w:r>
+        <w:t>0    CIN + Cable 0x09   Code Index Number 9 = Note On</w:t>
+      </w:r>
+    </w:p>
+    <w:p>
+      <w:r>
+        <w:t>1    Status      0x90   Note On op MIDI kanaal 0 (0x90 = 0x90 \| 0)</w:t>
+      </w:r>
+    </w:p>
+    <w:p>
+      <w:r>
+        <w:t>2    Data 1      60-127 MIDI nootnummer</w:t>
+      </w:r>
+    </w:p>
+    <w:p>
+      <w:r>
+        <w:t>3    Data 2      0-127  Velocity (aanslagnelheid)</w:t>
+      </w:r>
+    </w:p>
+    <w:p>
+      <w:r>
+        <w:rPr>
+          <w:b/>
+          <w:bCs/>
+          <w:sz w:val="36"/>
+          <w:szCs w:val="36"/>
+        </w:rPr>
+        <w:t>MIDI Note Mapping</w:t>
+      </w:r>
+    </w:p>
+    <w:p>
+      <w:r>
+        <w:t>De standaardformule voor matrix-naar-MIDI mapping is:</w:t>
+      </w:r>
+    </w:p>
+    <w:p>
+      <w:pPr>
+        <w:rPr>
+          <w:b/>
+          <w:bCs/>
+        </w:rPr>
+      </w:pPr>
+      <w:r>
+        <w:rPr>
+          <w:b/>
+          <w:bCs/>
+        </w:rPr>
+        <w:t>midi_noot = BASIS_NOOT + (rij × 4) + kolom</w:t>
+      </w:r>
+    </w:p>
+    <w:p>
+      <w:r>
+        <w:t xml:space="preserve">Met </w:t>
+      </w:r>
+      <w:r>
+        <w:rPr>
+          <w:b/>
+          <w:bCs/>
+        </w:rPr>
+        <w:t>BASIS_NOOT = 60</w:t>
+      </w:r>
+      <w:r>
+        <w:t xml:space="preserve"> (Midden C / C4):</w:t>
+      </w:r>
+    </w:p>
+    <w:p/>
+    <w:p>
+      <w:pPr>
+        <w:rPr>
+          <w:b/>
+          <w:bCs/>
+        </w:rPr>
+      </w:pPr>
+      <w:r>
+        <w:rPr>
+          <w:b/>
+          <w:bCs/>
+        </w:rPr>
+        <w:t>Berekening:</w:t>
+      </w:r>
+    </w:p>
+    <w:p>
+      <w:r>
+        <w:rPr>
+          <w:b/>
+          <w:bCs/>
+        </w:rPr>
+        <w:t>Rij 0:</w:t>
+      </w:r>
+      <w:r>
+        <w:t xml:space="preserve"> (0 × 4) = +0 - Kolom 0: 60 + 0 + 0 = </w:t>
+      </w:r>
+      <w:r>
+        <w:rPr>
+          <w:b/>
+          <w:bCs/>
+        </w:rPr>
+        <w:t>60 (C4)</w:t>
+      </w:r>
+      <w:r>
+        <w:t xml:space="preserve"> - Kolom 1:</w:t>
+      </w:r>
+    </w:p>
+    <w:p>
+      <w:pPr>
+        <w:rPr>
+          <w:lang w:val="de-DE"/>
+        </w:rPr>
+      </w:pPr>
+      <w:r>
+        <w:rPr>
+          <w:lang w:val="de-DE"/>
+        </w:rPr>
+        <w:t xml:space="preserve">60 + 0 + 1 = </w:t>
+      </w:r>
+      <w:r>
+        <w:rPr>
+          <w:b/>
+          <w:bCs/>
+          <w:lang w:val="de-DE"/>
+        </w:rPr>
+        <w:t>61 (C#4</w:t>
+      </w:r>
+      <w:r>
+        <w:rPr>
+          <w:b/>
+          <w:bCs/>
+          <w:lang w:val="de-DE"/>
+        </w:rPr>
+        <w:t>)</w:t>
+      </w:r>
+      <w:r>
+        <w:rPr>
+          <w:lang w:val="de-DE"/>
+        </w:rPr>
+        <w:t xml:space="preserve"> - Kolom 2: 60 + 0 + 2 = </w:t>
+      </w:r>
+      <w:r>
+        <w:rPr>
+          <w:b/>
+          <w:bCs/>
+          <w:lang w:val="de-DE"/>
+        </w:rPr>
+        <w:t>62 (D4)</w:t>
+      </w:r>
+      <w:r>
+        <w:rPr>
+          <w:lang w:val="de-DE"/>
+        </w:rPr>
+        <w:t xml:space="preserve"> - Kolom 3:</w:t>
+      </w:r>
+    </w:p>
+    <w:p>
+      <w:pPr>
+        <w:rPr>
+          <w:lang w:val="de-DE"/>
+        </w:rPr>
+      </w:pPr>
+      <w:r>
+        <w:rPr>
+          <w:lang w:val="de-DE"/>
+        </w:rPr>
+        <w:t xml:space="preserve">60 + 0 + 3 = </w:t>
+      </w:r>
+      <w:r>
+        <w:rPr>
+          <w:b/>
+          <w:bCs/>
+          <w:lang w:val="de-DE"/>
+        </w:rPr>
+        <w:t>63 (D#4)</w:t>
+      </w:r>
+    </w:p>
+    <w:p>
+      <w:pPr>
+        <w:rPr>
+          <w:lang w:val="de-DE"/>
+        </w:rPr>
+      </w:pPr>
+    </w:p>
+    <w:p>
+      <w:pPr>
+        <w:rPr>
+          <w:lang w:val="de-DE"/>
+        </w:rPr>
+      </w:pPr>
+      <w:r>
+        <w:rPr>
+          <w:b/>
+          <w:bCs/>
+          <w:lang w:val="de-DE"/>
+        </w:rPr>
+        <w:t>Rij 1</w:t>
+      </w:r>
+      <w:r>
+        <w:rPr>
+          <w:lang w:val="de-DE"/>
+        </w:rPr>
+        <w:t xml:space="preserve">: (1 × 4) = +4 - Kolom 0: 60 + 4 + 0 = </w:t>
+      </w:r>
+      <w:r>
+        <w:rPr>
+          <w:b/>
+          <w:bCs/>
+          <w:lang w:val="de-DE"/>
+        </w:rPr>
+        <w:t>64 (E4)</w:t>
+      </w:r>
+      <w:r>
+        <w:rPr>
+          <w:lang w:val="de-DE"/>
+        </w:rPr>
+        <w:t xml:space="preserve"> - Kolom 1:</w:t>
+      </w:r>
+    </w:p>
+    <w:p>
+      <w:pPr>
+        <w:rPr>
+          <w:lang w:val="de-DE"/>
+        </w:rPr>
+      </w:pPr>
+      <w:r>
+        <w:rPr>
+          <w:lang w:val="de-DE"/>
+        </w:rPr>
+        <w:t xml:space="preserve">60 + 4 + 1 = </w:t>
+      </w:r>
+      <w:r>
+        <w:rPr>
+          <w:b/>
+          <w:bCs/>
+          <w:lang w:val="de-DE"/>
+        </w:rPr>
+        <w:t>65 (F4)</w:t>
+      </w:r>
+      <w:r>
+        <w:rPr>
+          <w:lang w:val="de-DE"/>
+        </w:rPr>
+        <w:t xml:space="preserve"> - Kolom 2: 60 + 4 + 2 = </w:t>
+      </w:r>
+      <w:r>
+        <w:rPr>
+          <w:b/>
+          <w:bCs/>
+          <w:lang w:val="de-DE"/>
+        </w:rPr>
+        <w:t>66 (F#4)</w:t>
+      </w:r>
+      <w:r>
+        <w:rPr>
+          <w:lang w:val="de-DE"/>
+        </w:rPr>
+        <w:t xml:space="preserve"> - Kolom 3:</w:t>
+      </w:r>
+    </w:p>
+    <w:p>
+      <w:pPr>
+        <w:rPr>
+          <w:lang w:val="de-DE"/>
+        </w:rPr>
+      </w:pPr>
+      <w:r>
+        <w:rPr>
+          <w:lang w:val="de-DE"/>
+        </w:rPr>
+        <w:t xml:space="preserve">60 + 4 + 3 = </w:t>
+      </w:r>
+      <w:r>
+        <w:rPr>
+          <w:b/>
+          <w:bCs/>
+          <w:lang w:val="de-DE"/>
+        </w:rPr>
+        <w:t>67 (G4)</w:t>
+      </w:r>
+    </w:p>
+    <w:p>
+      <w:pPr>
+        <w:rPr>
+          <w:lang w:val="de-DE"/>
+        </w:rPr>
+      </w:pPr>
+    </w:p>
+    <w:p>
+      <w:pPr>
+        <w:rPr>
+          <w:b/>
+          <w:bCs/>
+          <w:lang w:val="de-DE"/>
+        </w:rPr>
+      </w:pPr>
+      <w:r>
+        <w:rPr>
+          <w:b/>
+          <w:bCs/>
+          <w:lang w:val="de-DE"/>
+        </w:rPr>
+        <w:t>Volledige Matrix:</w:t>
+      </w:r>
+    </w:p>
+    <w:p>
+      <w:pPr>
+        <w:rPr>
+          <w:lang w:val="de-DE"/>
+        </w:rPr>
+      </w:pPr>
+    </w:p>
+    <w:p>
+      <w:pPr>
+        <w:rPr>
+          <w:lang w:val="de-DE"/>
+        </w:rPr>
+      </w:pPr>
+      <w:r>
+        <w:rPr>
+          <w:lang w:val="de-DE"/>
+        </w:rPr>
+        <w:t xml:space="preserve">         KOL0  KOL1  KOL2  KOL3</w:t>
+      </w:r>
+    </w:p>
+    <w:p>
+      <w:r>
+        <w:rPr>
+          <w:lang w:val="de-DE"/>
+        </w:rPr>
+        <w:t xml:space="preserve">   </w:t>
+      </w:r>
+      <w:r>
+        <w:t>RIJ0   60    61    62    63   (C4 - D#4)</w:t>
+      </w:r>
+    </w:p>
+    <w:p>
+      <w:r>
+        <w:t xml:space="preserve">   RIJ1   64    65    66    67   (E4 - G4)</w:t>
+      </w:r>
+    </w:p>
+    <w:p>
+      <w:r>
+        <w:t xml:space="preserve">   RIJ2   68    69    70    71   (G#4 - B4)</w:t>
+      </w:r>
+    </w:p>
+    <w:p>
+      <w:r>
+        <w:t xml:space="preserve">   RIJ3   72    73    74    75   (C5 - D#5)</w:t>
+      </w:r>
+    </w:p>
+    <w:p/>
+    <w:p>
+      <w:r>
+        <w:rPr>
+          <w:b/>
+          <w:bCs/>
+          <w:sz w:val="36"/>
+          <w:szCs w:val="36"/>
+        </w:rPr>
+        <w:t>Systeeminitialisatie Volgorde</w:t>
+      </w:r>
+    </w:p>
+    <w:p>
+      <w:r>
+        <w:rPr>
+          <w:b/>
+          <w:bCs/>
+        </w:rPr>
+        <w:t>Waarom de volgorde belangrijk is:</w:t>
+      </w:r>
+    </w:p>
+    <w:p/>
+    <w:p>
+      <w:r>
+        <w:t xml:space="preserve">   int main(void) {</w:t>
+      </w:r>
+    </w:p>
+    <w:p>
+      <w:r>
+        <w:t xml:space="preserve">     // 1. HAL initialiseren (STM32 basis)</w:t>
+      </w:r>
+    </w:p>
+    <w:p>
+      <w:r>
+        <w:t xml:space="preserve">     HAL_Init();</w:t>
+      </w:r>
+    </w:p>
+    <w:p>
+      <w:r>
+        <w:t xml:space="preserve">     SystemClock_Config();</w:t>
+      </w:r>
+    </w:p>
+    <w:p>
+      <w:r>
+        <w:t xml:space="preserve">     </w:t>
+      </w:r>
+    </w:p>
+    <w:p>
+      <w:r>
+        <w:t xml:space="preserve">     // 2. GPIO's instellen (inclusief SPI pins)</w:t>
+      </w:r>
+    </w:p>
+    <w:p>
+      <w:r>
+        <w:t xml:space="preserve">     MX_GPIO_Init();</w:t>
+      </w:r>
+    </w:p>
+    <w:p>
+      <w:r>
+        <w:t xml:space="preserve">     MX_SPI_BitBang_Init();</w:t>
+      </w:r>
+    </w:p>
+    <w:p>
+      <w:r>
+        <w:t xml:space="preserve">     </w:t>
+      </w:r>
+    </w:p>
+    <w:p>
+      <w:r>
+        <w:t xml:space="preserve">     // 3. USB hardware initialiseren</w:t>
+      </w:r>
+    </w:p>
+    <w:p>
+      <w:r>
+        <w:t xml:space="preserve">     MX_USB_Init();</w:t>
+      </w:r>
+    </w:p>
+    <w:p>
+      <w:r>
+        <w:t xml:space="preserve">     </w:t>
+      </w:r>
+    </w:p>
+    <w:p>
+      <w:r>
+        <w:t xml:space="preserve">     // 4. MCP23S17 configureren (nu SPI beschikbaar is)</w:t>
+      </w:r>
+    </w:p>
+    <w:p>
+      <w:pPr>
+        <w:rPr>
+          <w:lang w:val="en-US"/>
+        </w:rPr>
+      </w:pPr>
+      <w:r>
+        <w:t xml:space="preserve">     </w:t>
+      </w:r>
+      <w:r>
+        <w:rPr>
+          <w:lang w:val="en-US"/>
+        </w:rPr>
+        <w:t>mcp23s17_init();</w:t>
+      </w:r>
+    </w:p>
+    <w:p>
+      <w:pPr>
+        <w:rPr>
+          <w:lang w:val="en-US"/>
+        </w:rPr>
+      </w:pPr>
+      <w:r>
+        <w:rPr>
+          <w:lang w:val="en-US"/>
+        </w:rPr>
+        <w:t xml:space="preserve">     </w:t>
+      </w:r>
+    </w:p>
+    <w:p>
+      <w:pPr>
+        <w:rPr>
+          <w:lang w:val="en-US"/>
+        </w:rPr>
+      </w:pPr>
+      <w:r>
+        <w:rPr>
+          <w:lang w:val="en-US"/>
+        </w:rPr>
+        <w:t xml:space="preserve">     // 5. TinyUSB stack starten</w:t>
+      </w:r>
+    </w:p>
+    <w:p>
+      <w:pPr>
+        <w:rPr>
+          <w:lang w:val="en-US"/>
+        </w:rPr>
+      </w:pPr>
+      <w:r>
+        <w:rPr>
+          <w:lang w:val="en-US"/>
+        </w:rPr>
+        <w:t xml:space="preserve">     tusb_init(BOARD_TUD_RHPORT, &amp;dev_init);</w:t>
+      </w:r>
+    </w:p>
+    <w:p>
+      <w:pPr>
+        <w:rPr>
+          <w:lang w:val="en-US"/>
+        </w:rPr>
+      </w:pPr>
+      <w:r>
+        <w:rPr>
+          <w:lang w:val="en-US"/>
+        </w:rPr>
+        <w:t xml:space="preserve">     </w:t>
+      </w:r>
+    </w:p>
+    <w:p>
+      <w:pPr>
+        <w:rPr>
+          <w:lang w:val="en-US"/>
+        </w:rPr>
+      </w:pPr>
+      <w:r>
+        <w:rPr>
+          <w:lang w:val="en-US"/>
+        </w:rPr>
+        <w:t xml:space="preserve">     // 6. Main loop - USB servicing is prioriteit</w:t>
+      </w:r>
+    </w:p>
+    <w:p>
+      <w:pPr>
+        <w:rPr>
+          <w:lang w:val="en-US"/>
+        </w:rPr>
+      </w:pPr>
+      <w:r>
+        <w:rPr>
+          <w:lang w:val="en-US"/>
+        </w:rPr>
+        <w:t xml:space="preserve">     while (1) {</w:t>
+      </w:r>
+    </w:p>
+    <w:p>
+      <w:pPr>
+        <w:rPr>
+          <w:lang w:val="en-US"/>
+        </w:rPr>
+      </w:pPr>
+      <w:r>
+        <w:rPr>
+          <w:lang w:val="en-US"/>
+        </w:rPr>
+        <w:t xml:space="preserve">       tud_task();        // Eerste! USB moet responsive zijn</w:t>
+      </w:r>
+    </w:p>
+    <w:p>
+      <w:pPr>
+        <w:rPr>
+          <w:lang w:val="en-US"/>
+        </w:rPr>
+      </w:pPr>
+      <w:r>
+        <w:rPr>
+          <w:lang w:val="en-US"/>
+        </w:rPr>
+        <w:t xml:space="preserve">       keypad_task();     // Daarna: matrix scannen</w:t>
+      </w:r>
+    </w:p>
+    <w:p>
+      <w:pPr>
+        <w:rPr>
+          <w:lang w:val="en-US"/>
+        </w:rPr>
+      </w:pPr>
+      <w:r>
+        <w:rPr>
+          <w:lang w:val="en-US"/>
+        </w:rPr>
+        <w:t xml:space="preserve">       midi_task();       // Laast: inkomende MIDI verwerken</w:t>
+      </w:r>
+    </w:p>
+    <w:p>
+      <w:r>
+        <w:rPr>
+          <w:lang w:val="en-US"/>
+        </w:rPr>
+        <w:t xml:space="preserve">     </w:t>
+      </w:r>
+      <w:r>
+        <w:t>}</w:t>
+      </w:r>
+    </w:p>
+    <w:p>
+      <w:r>
+        <w:t xml:space="preserve">   }</w:t>
+      </w:r>
+    </w:p>
+    <w:p/>
+    <w:p>
+      <w:r>
+        <w:rPr>
+          <w:b/>
+          <w:bCs/>
+        </w:rPr>
+        <w:t>Waarom deze volgorde:</w:t>
+      </w:r>
+      <w:r>
+        <w:t xml:space="preserve"> 1. HAL = Hardware driver basis 2. GPIO/SPI =</w:t>
+      </w:r>
+    </w:p>
+    <w:p>
+      <w:r>
+        <w:t xml:space="preserve">Communicatie kanalen beschikbaar 3. </w:t>
+      </w:r>
+      <w:r>
+        <w:rPr>
+          <w:lang w:val="en-US"/>
+        </w:rPr>
+        <w:t>USB hardware = Physical interface</w:t>
+      </w:r>
+      <w:r>
+        <w:rPr>
+          <w:lang w:val="en-US"/>
+        </w:rPr>
+        <w:t xml:space="preserve"> </w:t>
+      </w:r>
+      <w:r>
+        <w:rPr>
+          <w:lang w:val="en-US"/>
+        </w:rPr>
+        <w:t xml:space="preserve">gereed 4. </w:t>
+      </w:r>
+      <w:r>
+        <w:t>MCP23S17 = Nu kunnen we deze configureren via SPI 5. TinyUSB =</w:t>
+      </w:r>
+      <w:r>
+        <w:t xml:space="preserve"> </w:t>
+      </w:r>
+      <w:r>
+        <w:t>Middleware klaar om te werken 6. Main loop = USB moet snelste refresh</w:t>
+      </w:r>
+      <w:r>
+        <w:t xml:space="preserve"> </w:t>
+      </w:r>
+      <w:r>
+        <w:t>krijgen</w:t>
+      </w:r>
+      <w:r>
+        <w:t>.</w:t>
+      </w:r>
+    </w:p>
+    <w:p/>
+    <w:p/>
+    <w:p/>
     <w:sectPr>
       <w:pgSz w:w="11906" w:h="16838"/>
       <w:pgMar w:top="1440" w:right="1440" w:bottom="1440" w:left="1440" w:header="708" w:footer="708" w:gutter="0"/>
@@ -1936,7 +5160,10 @@
   <w:style w:type="paragraph" w:default="1" w:styleId="Normal">
     <w:name w:val="Normal"/>
     <w:qFormat/>
-    <w:rsid w:val="00963CDD"/>
+    <w:rsid w:val="003349F5"/>
+    <w:rPr>
+      <w:lang w:val="nl-NL"/>
+    </w:rPr>
   </w:style>
   <w:style w:type="paragraph" w:styleId="Heading1">
     <w:name w:val="heading 1"/>

</xml_diff>